<commit_message>
Complete batch reporting and live approval integration
</commit_message>
<xml_diff>
--- a/Expense_Tracker_Mainframe_Project_Explanation.docx
+++ b/Expense_Tracker_Mainframe_Project_Explanation.docx
@@ -3702,7 +3702,7 @@
                 <w:b w:val="0"/>
                 <w:sz w:val="18"/>
               </w:rPr>
-              <w:t>Per-request transaction input</w:t>
+              <w:t>One FB80 transaction input dataset per finance batch</w:t>
             </w:r>
           </w:p>
         </w:tc>
@@ -3759,7 +3759,7 @@
                 <w:b w:val="0"/>
                 <w:sz w:val="18"/>
               </w:rPr>
-              <w:t>Z86073.EXPTRK.RESULT</w:t>
+              <w:t>Z86073.EXPTRK.RES.*</w:t>
             </w:r>
           </w:p>
         </w:tc>
@@ -3787,7 +3787,7 @@
                 <w:b w:val="0"/>
                 <w:sz w:val="18"/>
               </w:rPr>
-              <w:t>EXPPOST result records</w:t>
+              <w:t>Batch-scoped EXPPOST result records</w:t>
             </w:r>
           </w:p>
         </w:tc>
@@ -5744,12 +5744,2264 @@
         <w:keepNext/>
       </w:pPr>
       <w:r>
+        <w:t>Detailed Module Working</w:t>
+      </w:r>
+    </w:p>
+    <w:p>
+      <w:r>
+        <w:t>The project is divided into cooperating modules. Each module has a clear boundary so that a failure in one layer is visible as a controlled error instead of being reported as a false successful expense post.</w:t>
+      </w:r>
+    </w:p>
+    <w:p>
+      <w:pPr>
+        <w:pStyle w:val="Heading2"/>
+        <w:keepNext/>
+      </w:pPr>
+      <w:r>
+        <w:t>Module 1 Frontend and User Roles</w:t>
+      </w:r>
+    </w:p>
+    <w:p>
+      <w:r>
+        <w:t>The browser application is served by Node.js. It presents different pages according to the authenticated user permissions. Employees create and submit claims, managers review assigned claims, finance users run posting batches, administrators maintain approved reference data, and auditors receive read-only access. In live mode, the UI calls the Node same-origin proxy; it never receives Zowe credentials.</w:t>
+      </w:r>
+    </w:p>
+    <w:tbl>
+      <w:tblPr>
+        <w:tblStyle w:val="TableGrid"/>
+        <w:tblW w:type="auto" w:w="0"/>
+        <w:jc w:val="center"/>
+        <w:tblLook w:firstColumn="1" w:firstRow="1" w:lastColumn="0" w:lastRow="0" w:noHBand="0" w:noVBand="1" w:val="04A0"/>
+      </w:tblPr>
+      <w:tblGrid>
+        <w:gridCol w:w="2484"/>
+        <w:gridCol w:w="2484"/>
+        <w:gridCol w:w="2484"/>
+        <w:gridCol w:w="2484"/>
+      </w:tblGrid>
+      <w:tr>
+        <w:tc>
+          <w:tcPr>
+            <w:tcW w:type="dxa" w:w="2484"/>
+            <w:vAlign w:val="center"/>
+            <w:tcBorders>
+              <w:top w:val="single" w:sz="6" w:space="0" w:color="D9D9D9"/>
+              <w:left w:val="single" w:sz="6" w:space="0" w:color="D9D9D9"/>
+              <w:bottom w:val="single" w:sz="6" w:space="0" w:color="D9D9D9"/>
+              <w:right w:val="single" w:sz="6" w:space="0" w:color="D9D9D9"/>
+              <w:insideH w:val="single" w:sz="6" w:space="0" w:color="D9D9D9"/>
+              <w:insideV w:val="single" w:sz="6" w:space="0" w:color="D9D9D9"/>
+            </w:tcBorders>
+            <w:shd w:fill="17365D"/>
+          </w:tcPr>
+          <w:p>
+            <w:pPr>
+              <w:spacing w:after="0"/>
+            </w:pPr>
+            <w:r/>
+            <w:r>
+              <w:rPr>
+                <w:b/>
+                <w:color w:val="FFFFFF"/>
+                <w:sz w:val="18"/>
+              </w:rPr>
+              <w:t>Input</w:t>
+            </w:r>
+          </w:p>
+        </w:tc>
+        <w:tc>
+          <w:tcPr>
+            <w:tcW w:type="dxa" w:w="2484"/>
+            <w:vAlign w:val="center"/>
+            <w:tcBorders>
+              <w:top w:val="single" w:sz="6" w:space="0" w:color="D9D9D9"/>
+              <w:left w:val="single" w:sz="6" w:space="0" w:color="D9D9D9"/>
+              <w:bottom w:val="single" w:sz="6" w:space="0" w:color="D9D9D9"/>
+              <w:right w:val="single" w:sz="6" w:space="0" w:color="D9D9D9"/>
+              <w:insideH w:val="single" w:sz="6" w:space="0" w:color="D9D9D9"/>
+              <w:insideV w:val="single" w:sz="6" w:space="0" w:color="D9D9D9"/>
+            </w:tcBorders>
+            <w:shd w:fill="17365D"/>
+          </w:tcPr>
+          <w:p>
+            <w:pPr>
+              <w:spacing w:after="0"/>
+            </w:pPr>
+            <w:r/>
+            <w:r>
+              <w:rPr>
+                <w:b/>
+                <w:color w:val="FFFFFF"/>
+                <w:sz w:val="18"/>
+              </w:rPr>
+              <w:t>Processing</w:t>
+            </w:r>
+          </w:p>
+        </w:tc>
+        <w:tc>
+          <w:tcPr>
+            <w:tcW w:type="dxa" w:w="2484"/>
+            <w:vAlign w:val="center"/>
+            <w:tcBorders>
+              <w:top w:val="single" w:sz="6" w:space="0" w:color="D9D9D9"/>
+              <w:left w:val="single" w:sz="6" w:space="0" w:color="D9D9D9"/>
+              <w:bottom w:val="single" w:sz="6" w:space="0" w:color="D9D9D9"/>
+              <w:right w:val="single" w:sz="6" w:space="0" w:color="D9D9D9"/>
+              <w:insideH w:val="single" w:sz="6" w:space="0" w:color="D9D9D9"/>
+              <w:insideV w:val="single" w:sz="6" w:space="0" w:color="D9D9D9"/>
+            </w:tcBorders>
+            <w:shd w:fill="17365D"/>
+          </w:tcPr>
+          <w:p>
+            <w:pPr>
+              <w:spacing w:after="0"/>
+            </w:pPr>
+            <w:r/>
+            <w:r>
+              <w:rPr>
+                <w:b/>
+                <w:color w:val="FFFFFF"/>
+                <w:sz w:val="18"/>
+              </w:rPr>
+              <w:t>Output</w:t>
+            </w:r>
+          </w:p>
+        </w:tc>
+        <w:tc>
+          <w:tcPr>
+            <w:tcW w:type="dxa" w:w="2484"/>
+            <w:vAlign w:val="center"/>
+            <w:tcBorders>
+              <w:top w:val="single" w:sz="6" w:space="0" w:color="D9D9D9"/>
+              <w:left w:val="single" w:sz="6" w:space="0" w:color="D9D9D9"/>
+              <w:bottom w:val="single" w:sz="6" w:space="0" w:color="D9D9D9"/>
+              <w:right w:val="single" w:sz="6" w:space="0" w:color="D9D9D9"/>
+              <w:insideH w:val="single" w:sz="6" w:space="0" w:color="D9D9D9"/>
+              <w:insideV w:val="single" w:sz="6" w:space="0" w:color="D9D9D9"/>
+            </w:tcBorders>
+            <w:shd w:fill="17365D"/>
+          </w:tcPr>
+          <w:p>
+            <w:pPr>
+              <w:spacing w:after="0"/>
+            </w:pPr>
+            <w:r/>
+            <w:r>
+              <w:rPr>
+                <w:b/>
+                <w:color w:val="FFFFFF"/>
+                <w:sz w:val="18"/>
+              </w:rPr>
+              <w:t>Main files</w:t>
+            </w:r>
+          </w:p>
+        </w:tc>
+      </w:tr>
+      <w:tr>
+        <w:tc>
+          <w:tcPr>
+            <w:tcW w:type="dxa" w:w="2484"/>
+            <w:vAlign w:val="center"/>
+            <w:tcBorders>
+              <w:top w:val="single" w:sz="6" w:space="0" w:color="D9D9D9"/>
+              <w:left w:val="single" w:sz="6" w:space="0" w:color="D9D9D9"/>
+              <w:bottom w:val="single" w:sz="6" w:space="0" w:color="D9D9D9"/>
+              <w:right w:val="single" w:sz="6" w:space="0" w:color="D9D9D9"/>
+              <w:insideH w:val="single" w:sz="6" w:space="0" w:color="D9D9D9"/>
+              <w:insideV w:val="single" w:sz="6" w:space="0" w:color="D9D9D9"/>
+            </w:tcBorders>
+          </w:tcPr>
+          <w:p>
+            <w:pPr>
+              <w:spacing w:after="0"/>
+            </w:pPr>
+            <w:r/>
+            <w:r>
+              <w:rPr>
+                <w:b w:val="0"/>
+                <w:sz w:val="18"/>
+              </w:rPr>
+              <w:t>Username and password; expense form fields</w:t>
+            </w:r>
+          </w:p>
+        </w:tc>
+        <w:tc>
+          <w:tcPr>
+            <w:tcW w:type="dxa" w:w="2484"/>
+            <w:vAlign w:val="center"/>
+            <w:tcBorders>
+              <w:top w:val="single" w:sz="6" w:space="0" w:color="D9D9D9"/>
+              <w:left w:val="single" w:sz="6" w:space="0" w:color="D9D9D9"/>
+              <w:bottom w:val="single" w:sz="6" w:space="0" w:color="D9D9D9"/>
+              <w:right w:val="single" w:sz="6" w:space="0" w:color="D9D9D9"/>
+              <w:insideH w:val="single" w:sz="6" w:space="0" w:color="D9D9D9"/>
+              <w:insideV w:val="single" w:sz="6" w:space="0" w:color="D9D9D9"/>
+            </w:tcBorders>
+          </w:tcPr>
+          <w:p>
+            <w:pPr>
+              <w:spacing w:after="0"/>
+            </w:pPr>
+            <w:r/>
+            <w:r>
+              <w:rPr>
+                <w:b w:val="0"/>
+                <w:sz w:val="18"/>
+              </w:rPr>
+              <w:t>Session login, role-based navigation, client validation, API request</w:t>
+            </w:r>
+          </w:p>
+        </w:tc>
+        <w:tc>
+          <w:tcPr>
+            <w:tcW w:type="dxa" w:w="2484"/>
+            <w:vAlign w:val="center"/>
+            <w:tcBorders>
+              <w:top w:val="single" w:sz="6" w:space="0" w:color="D9D9D9"/>
+              <w:left w:val="single" w:sz="6" w:space="0" w:color="D9D9D9"/>
+              <w:bottom w:val="single" w:sz="6" w:space="0" w:color="D9D9D9"/>
+              <w:right w:val="single" w:sz="6" w:space="0" w:color="D9D9D9"/>
+              <w:insideH w:val="single" w:sz="6" w:space="0" w:color="D9D9D9"/>
+              <w:insideV w:val="single" w:sz="6" w:space="0" w:color="D9D9D9"/>
+            </w:tcBorders>
+          </w:tcPr>
+          <w:p>
+            <w:pPr>
+              <w:spacing w:after="0"/>
+            </w:pPr>
+            <w:r/>
+            <w:r>
+              <w:rPr>
+                <w:b w:val="0"/>
+                <w:sz w:val="18"/>
+              </w:rPr>
+              <w:t>Dashboard, claim status, approval screen, batch status, report view</w:t>
+            </w:r>
+          </w:p>
+        </w:tc>
+        <w:tc>
+          <w:tcPr>
+            <w:tcW w:type="dxa" w:w="2484"/>
+            <w:vAlign w:val="center"/>
+            <w:tcBorders>
+              <w:top w:val="single" w:sz="6" w:space="0" w:color="D9D9D9"/>
+              <w:left w:val="single" w:sz="6" w:space="0" w:color="D9D9D9"/>
+              <w:bottom w:val="single" w:sz="6" w:space="0" w:color="D9D9D9"/>
+              <w:right w:val="single" w:sz="6" w:space="0" w:color="D9D9D9"/>
+              <w:insideH w:val="single" w:sz="6" w:space="0" w:color="D9D9D9"/>
+              <w:insideV w:val="single" w:sz="6" w:space="0" w:color="D9D9D9"/>
+            </w:tcBorders>
+          </w:tcPr>
+          <w:p>
+            <w:pPr>
+              <w:spacing w:after="0"/>
+            </w:pPr>
+            <w:r/>
+            <w:r>
+              <w:rPr>
+                <w:b w:val="0"/>
+                <w:sz w:val="18"/>
+              </w:rPr>
+              <w:t>public/index.html, public/live-workflow.js</w:t>
+            </w:r>
+          </w:p>
+        </w:tc>
+      </w:tr>
+      <w:tr>
+        <w:tc>
+          <w:tcPr>
+            <w:tcW w:type="dxa" w:w="2484"/>
+            <w:vAlign w:val="center"/>
+            <w:tcBorders>
+              <w:top w:val="single" w:sz="6" w:space="0" w:color="D9D9D9"/>
+              <w:left w:val="single" w:sz="6" w:space="0" w:color="D9D9D9"/>
+              <w:bottom w:val="single" w:sz="6" w:space="0" w:color="D9D9D9"/>
+              <w:right w:val="single" w:sz="6" w:space="0" w:color="D9D9D9"/>
+              <w:insideH w:val="single" w:sz="6" w:space="0" w:color="D9D9D9"/>
+              <w:insideV w:val="single" w:sz="6" w:space="0" w:color="D9D9D9"/>
+            </w:tcBorders>
+            <w:shd w:fill="F3F5F7"/>
+          </w:tcPr>
+          <w:p>
+            <w:pPr>
+              <w:spacing w:after="0"/>
+            </w:pPr>
+            <w:r/>
+            <w:r>
+              <w:rPr>
+                <w:b w:val="0"/>
+                <w:sz w:val="18"/>
+              </w:rPr>
+              <w:t>Employee claim</w:t>
+            </w:r>
+          </w:p>
+        </w:tc>
+        <w:tc>
+          <w:tcPr>
+            <w:tcW w:type="dxa" w:w="2484"/>
+            <w:vAlign w:val="center"/>
+            <w:tcBorders>
+              <w:top w:val="single" w:sz="6" w:space="0" w:color="D9D9D9"/>
+              <w:left w:val="single" w:sz="6" w:space="0" w:color="D9D9D9"/>
+              <w:bottom w:val="single" w:sz="6" w:space="0" w:color="D9D9D9"/>
+              <w:right w:val="single" w:sz="6" w:space="0" w:color="D9D9D9"/>
+              <w:insideH w:val="single" w:sz="6" w:space="0" w:color="D9D9D9"/>
+              <w:insideV w:val="single" w:sz="6" w:space="0" w:color="D9D9D9"/>
+            </w:tcBorders>
+            <w:shd w:fill="F3F5F7"/>
+          </w:tcPr>
+          <w:p>
+            <w:pPr>
+              <w:spacing w:after="0"/>
+            </w:pPr>
+            <w:r/>
+            <w:r>
+              <w:rPr>
+                <w:b w:val="0"/>
+                <w:sz w:val="18"/>
+              </w:rPr>
+              <w:t>Create, edit, submit, display pending state</w:t>
+            </w:r>
+          </w:p>
+        </w:tc>
+        <w:tc>
+          <w:tcPr>
+            <w:tcW w:type="dxa" w:w="2484"/>
+            <w:vAlign w:val="center"/>
+            <w:tcBorders>
+              <w:top w:val="single" w:sz="6" w:space="0" w:color="D9D9D9"/>
+              <w:left w:val="single" w:sz="6" w:space="0" w:color="D9D9D9"/>
+              <w:bottom w:val="single" w:sz="6" w:space="0" w:color="D9D9D9"/>
+              <w:right w:val="single" w:sz="6" w:space="0" w:color="D9D9D9"/>
+              <w:insideH w:val="single" w:sz="6" w:space="0" w:color="D9D9D9"/>
+              <w:insideV w:val="single" w:sz="6" w:space="0" w:color="D9D9D9"/>
+            </w:tcBorders>
+            <w:shd w:fill="F3F5F7"/>
+          </w:tcPr>
+          <w:p>
+            <w:pPr>
+              <w:spacing w:after="0"/>
+            </w:pPr>
+            <w:r/>
+            <w:r>
+              <w:rPr>
+                <w:b w:val="0"/>
+                <w:sz w:val="18"/>
+              </w:rPr>
+              <w:t>Pending approval claim</w:t>
+            </w:r>
+          </w:p>
+        </w:tc>
+        <w:tc>
+          <w:tcPr>
+            <w:tcW w:type="dxa" w:w="2484"/>
+            <w:vAlign w:val="center"/>
+            <w:tcBorders>
+              <w:top w:val="single" w:sz="6" w:space="0" w:color="D9D9D9"/>
+              <w:left w:val="single" w:sz="6" w:space="0" w:color="D9D9D9"/>
+              <w:bottom w:val="single" w:sz="6" w:space="0" w:color="D9D9D9"/>
+              <w:right w:val="single" w:sz="6" w:space="0" w:color="D9D9D9"/>
+              <w:insideH w:val="single" w:sz="6" w:space="0" w:color="D9D9D9"/>
+              <w:insideV w:val="single" w:sz="6" w:space="0" w:color="D9D9D9"/>
+            </w:tcBorders>
+            <w:shd w:fill="F3F5F7"/>
+          </w:tcPr>
+          <w:p>
+            <w:pPr>
+              <w:spacing w:after="0"/>
+            </w:pPr>
+            <w:r/>
+            <w:r>
+              <w:rPr>
+                <w:b w:val="0"/>
+                <w:sz w:val="18"/>
+              </w:rPr>
+              <w:t>public/index.html, server.js</w:t>
+            </w:r>
+          </w:p>
+        </w:tc>
+      </w:tr>
+      <w:tr>
+        <w:tc>
+          <w:tcPr>
+            <w:tcW w:type="dxa" w:w="2484"/>
+            <w:vAlign w:val="center"/>
+            <w:tcBorders>
+              <w:top w:val="single" w:sz="6" w:space="0" w:color="D9D9D9"/>
+              <w:left w:val="single" w:sz="6" w:space="0" w:color="D9D9D9"/>
+              <w:bottom w:val="single" w:sz="6" w:space="0" w:color="D9D9D9"/>
+              <w:right w:val="single" w:sz="6" w:space="0" w:color="D9D9D9"/>
+              <w:insideH w:val="single" w:sz="6" w:space="0" w:color="D9D9D9"/>
+              <w:insideV w:val="single" w:sz="6" w:space="0" w:color="D9D9D9"/>
+            </w:tcBorders>
+          </w:tcPr>
+          <w:p>
+            <w:pPr>
+              <w:spacing w:after="0"/>
+            </w:pPr>
+            <w:r/>
+            <w:r>
+              <w:rPr>
+                <w:b w:val="0"/>
+                <w:sz w:val="18"/>
+              </w:rPr>
+              <w:t>Manager action</w:t>
+            </w:r>
+          </w:p>
+        </w:tc>
+        <w:tc>
+          <w:tcPr>
+            <w:tcW w:type="dxa" w:w="2484"/>
+            <w:vAlign w:val="center"/>
+            <w:tcBorders>
+              <w:top w:val="single" w:sz="6" w:space="0" w:color="D9D9D9"/>
+              <w:left w:val="single" w:sz="6" w:space="0" w:color="D9D9D9"/>
+              <w:bottom w:val="single" w:sz="6" w:space="0" w:color="D9D9D9"/>
+              <w:right w:val="single" w:sz="6" w:space="0" w:color="D9D9D9"/>
+              <w:insideH w:val="single" w:sz="6" w:space="0" w:color="D9D9D9"/>
+              <w:insideV w:val="single" w:sz="6" w:space="0" w:color="D9D9D9"/>
+            </w:tcBorders>
+          </w:tcPr>
+          <w:p>
+            <w:pPr>
+              <w:spacing w:after="0"/>
+            </w:pPr>
+            <w:r/>
+            <w:r>
+              <w:rPr>
+                <w:b w:val="0"/>
+                <w:sz w:val="18"/>
+              </w:rPr>
+              <w:t>Approve or reject; rejection requires reason</w:t>
+            </w:r>
+          </w:p>
+        </w:tc>
+        <w:tc>
+          <w:tcPr>
+            <w:tcW w:type="dxa" w:w="2484"/>
+            <w:vAlign w:val="center"/>
+            <w:tcBorders>
+              <w:top w:val="single" w:sz="6" w:space="0" w:color="D9D9D9"/>
+              <w:left w:val="single" w:sz="6" w:space="0" w:color="D9D9D9"/>
+              <w:bottom w:val="single" w:sz="6" w:space="0" w:color="D9D9D9"/>
+              <w:right w:val="single" w:sz="6" w:space="0" w:color="D9D9D9"/>
+              <w:insideH w:val="single" w:sz="6" w:space="0" w:color="D9D9D9"/>
+              <w:insideV w:val="single" w:sz="6" w:space="0" w:color="D9D9D9"/>
+            </w:tcBorders>
+          </w:tcPr>
+          <w:p>
+            <w:pPr>
+              <w:spacing w:after="0"/>
+            </w:pPr>
+            <w:r/>
+            <w:r>
+              <w:rPr>
+                <w:b w:val="0"/>
+                <w:sz w:val="18"/>
+              </w:rPr>
+              <w:t>Approved or Rejected status</w:t>
+            </w:r>
+          </w:p>
+        </w:tc>
+        <w:tc>
+          <w:tcPr>
+            <w:tcW w:type="dxa" w:w="2484"/>
+            <w:vAlign w:val="center"/>
+            <w:tcBorders>
+              <w:top w:val="single" w:sz="6" w:space="0" w:color="D9D9D9"/>
+              <w:left w:val="single" w:sz="6" w:space="0" w:color="D9D9D9"/>
+              <w:bottom w:val="single" w:sz="6" w:space="0" w:color="D9D9D9"/>
+              <w:right w:val="single" w:sz="6" w:space="0" w:color="D9D9D9"/>
+              <w:insideH w:val="single" w:sz="6" w:space="0" w:color="D9D9D9"/>
+              <w:insideV w:val="single" w:sz="6" w:space="0" w:color="D9D9D9"/>
+            </w:tcBorders>
+          </w:tcPr>
+          <w:p>
+            <w:pPr>
+              <w:spacing w:after="0"/>
+            </w:pPr>
+            <w:r/>
+            <w:r>
+              <w:rPr>
+                <w:b w:val="0"/>
+                <w:sz w:val="18"/>
+              </w:rPr>
+              <w:t>public/index.html, server.js</w:t>
+            </w:r>
+          </w:p>
+        </w:tc>
+      </w:tr>
+      <w:tr>
+        <w:tc>
+          <w:tcPr>
+            <w:tcW w:type="dxa" w:w="2484"/>
+            <w:vAlign w:val="center"/>
+            <w:tcBorders>
+              <w:top w:val="single" w:sz="6" w:space="0" w:color="D9D9D9"/>
+              <w:left w:val="single" w:sz="6" w:space="0" w:color="D9D9D9"/>
+              <w:bottom w:val="single" w:sz="6" w:space="0" w:color="D9D9D9"/>
+              <w:right w:val="single" w:sz="6" w:space="0" w:color="D9D9D9"/>
+              <w:insideH w:val="single" w:sz="6" w:space="0" w:color="D9D9D9"/>
+              <w:insideV w:val="single" w:sz="6" w:space="0" w:color="D9D9D9"/>
+            </w:tcBorders>
+            <w:shd w:fill="F3F5F7"/>
+          </w:tcPr>
+          <w:p>
+            <w:pPr>
+              <w:spacing w:after="0"/>
+            </w:pPr>
+            <w:r/>
+            <w:r>
+              <w:rPr>
+                <w:b w:val="0"/>
+                <w:sz w:val="18"/>
+              </w:rPr>
+              <w:t>Finance action</w:t>
+            </w:r>
+          </w:p>
+        </w:tc>
+        <w:tc>
+          <w:tcPr>
+            <w:tcW w:type="dxa" w:w="2484"/>
+            <w:vAlign w:val="center"/>
+            <w:tcBorders>
+              <w:top w:val="single" w:sz="6" w:space="0" w:color="D9D9D9"/>
+              <w:left w:val="single" w:sz="6" w:space="0" w:color="D9D9D9"/>
+              <w:bottom w:val="single" w:sz="6" w:space="0" w:color="D9D9D9"/>
+              <w:right w:val="single" w:sz="6" w:space="0" w:color="D9D9D9"/>
+              <w:insideH w:val="single" w:sz="6" w:space="0" w:color="D9D9D9"/>
+              <w:insideV w:val="single" w:sz="6" w:space="0" w:color="D9D9D9"/>
+            </w:tcBorders>
+            <w:shd w:fill="F3F5F7"/>
+          </w:tcPr>
+          <w:p>
+            <w:pPr>
+              <w:spacing w:after="0"/>
+            </w:pPr>
+            <w:r/>
+            <w:r>
+              <w:rPr>
+                <w:b w:val="0"/>
+                <w:sz w:val="18"/>
+              </w:rPr>
+              <w:t>Start batch and monitor result</w:t>
+            </w:r>
+          </w:p>
+        </w:tc>
+        <w:tc>
+          <w:tcPr>
+            <w:tcW w:type="dxa" w:w="2484"/>
+            <w:vAlign w:val="center"/>
+            <w:tcBorders>
+              <w:top w:val="single" w:sz="6" w:space="0" w:color="D9D9D9"/>
+              <w:left w:val="single" w:sz="6" w:space="0" w:color="D9D9D9"/>
+              <w:bottom w:val="single" w:sz="6" w:space="0" w:color="D9D9D9"/>
+              <w:right w:val="single" w:sz="6" w:space="0" w:color="D9D9D9"/>
+              <w:insideH w:val="single" w:sz="6" w:space="0" w:color="D9D9D9"/>
+              <w:insideV w:val="single" w:sz="6" w:space="0" w:color="D9D9D9"/>
+            </w:tcBorders>
+            <w:shd w:fill="F3F5F7"/>
+          </w:tcPr>
+          <w:p>
+            <w:pPr>
+              <w:spacing w:after="0"/>
+            </w:pPr>
+            <w:r/>
+            <w:r>
+              <w:rPr>
+                <w:b w:val="0"/>
+                <w:sz w:val="18"/>
+              </w:rPr>
+              <w:t>Posted, rejected, or failed status</w:t>
+            </w:r>
+          </w:p>
+        </w:tc>
+        <w:tc>
+          <w:tcPr>
+            <w:tcW w:type="dxa" w:w="2484"/>
+            <w:vAlign w:val="center"/>
+            <w:tcBorders>
+              <w:top w:val="single" w:sz="6" w:space="0" w:color="D9D9D9"/>
+              <w:left w:val="single" w:sz="6" w:space="0" w:color="D9D9D9"/>
+              <w:bottom w:val="single" w:sz="6" w:space="0" w:color="D9D9D9"/>
+              <w:right w:val="single" w:sz="6" w:space="0" w:color="D9D9D9"/>
+              <w:insideH w:val="single" w:sz="6" w:space="0" w:color="D9D9D9"/>
+              <w:insideV w:val="single" w:sz="6" w:space="0" w:color="D9D9D9"/>
+            </w:tcBorders>
+            <w:shd w:fill="F3F5F7"/>
+          </w:tcPr>
+          <w:p>
+            <w:pPr>
+              <w:spacing w:after="0"/>
+            </w:pPr>
+            <w:r/>
+            <w:r>
+              <w:rPr>
+                <w:b w:val="0"/>
+                <w:sz w:val="18"/>
+              </w:rPr>
+              <w:t>public/live-workflow.js</w:t>
+            </w:r>
+          </w:p>
+        </w:tc>
+      </w:tr>
+    </w:tbl>
+    <w:p>
+      <w:pPr>
+        <w:spacing w:after="20"/>
+      </w:pPr>
+    </w:p>
+    <w:p>
+      <w:pPr>
+        <w:pStyle w:val="Heading2"/>
+        <w:keepNext/>
+      </w:pPr>
+      <w:r>
+        <w:t>Module 2 Node Authentication and Local Workflow</w:t>
+      </w:r>
+    </w:p>
+    <w:p>
+      <w:r>
+        <w:t>The Node server is responsible for the local demo boundary. It stores hashed demo credentials, creates HttpOnly SameSite session cookies, ignores forged role headers, applies permissions, and records audit events. The workflow module stores drafts, approvals, posted transaction IDs, batch metadata, and audit records in local JSON files for demo mode. It deliberately does not pretend to be VSAM.</w:t>
+      </w:r>
+    </w:p>
+    <w:tbl>
+      <w:tblPr>
+        <w:tblStyle w:val="TableGrid"/>
+        <w:tblW w:type="auto" w:w="0"/>
+        <w:jc w:val="center"/>
+        <w:tblLook w:firstColumn="1" w:firstRow="1" w:lastColumn="0" w:lastRow="0" w:noHBand="0" w:noVBand="1" w:val="04A0"/>
+      </w:tblPr>
+      <w:tblGrid>
+        <w:gridCol w:w="3312"/>
+        <w:gridCol w:w="3312"/>
+        <w:gridCol w:w="3312"/>
+      </w:tblGrid>
+      <w:tr>
+        <w:tc>
+          <w:tcPr>
+            <w:tcW w:type="dxa" w:w="3312"/>
+            <w:vAlign w:val="center"/>
+            <w:tcBorders>
+              <w:top w:val="single" w:sz="6" w:space="0" w:color="D9D9D9"/>
+              <w:left w:val="single" w:sz="6" w:space="0" w:color="D9D9D9"/>
+              <w:bottom w:val="single" w:sz="6" w:space="0" w:color="D9D9D9"/>
+              <w:right w:val="single" w:sz="6" w:space="0" w:color="D9D9D9"/>
+              <w:insideH w:val="single" w:sz="6" w:space="0" w:color="D9D9D9"/>
+              <w:insideV w:val="single" w:sz="6" w:space="0" w:color="D9D9D9"/>
+            </w:tcBorders>
+            <w:shd w:fill="17365D"/>
+          </w:tcPr>
+          <w:p>
+            <w:pPr>
+              <w:spacing w:after="0"/>
+            </w:pPr>
+            <w:r/>
+            <w:r>
+              <w:rPr>
+                <w:b/>
+                <w:color w:val="FFFFFF"/>
+                <w:sz w:val="18"/>
+              </w:rPr>
+              <w:t>Stage</w:t>
+            </w:r>
+          </w:p>
+        </w:tc>
+        <w:tc>
+          <w:tcPr>
+            <w:tcW w:type="dxa" w:w="3312"/>
+            <w:vAlign w:val="center"/>
+            <w:tcBorders>
+              <w:top w:val="single" w:sz="6" w:space="0" w:color="D9D9D9"/>
+              <w:left w:val="single" w:sz="6" w:space="0" w:color="D9D9D9"/>
+              <w:bottom w:val="single" w:sz="6" w:space="0" w:color="D9D9D9"/>
+              <w:right w:val="single" w:sz="6" w:space="0" w:color="D9D9D9"/>
+              <w:insideH w:val="single" w:sz="6" w:space="0" w:color="D9D9D9"/>
+              <w:insideV w:val="single" w:sz="6" w:space="0" w:color="D9D9D9"/>
+            </w:tcBorders>
+            <w:shd w:fill="17365D"/>
+          </w:tcPr>
+          <w:p>
+            <w:pPr>
+              <w:spacing w:after="0"/>
+            </w:pPr>
+            <w:r/>
+            <w:r>
+              <w:rPr>
+                <w:b/>
+                <w:color w:val="FFFFFF"/>
+                <w:sz w:val="18"/>
+              </w:rPr>
+              <w:t>Rule</w:t>
+            </w:r>
+          </w:p>
+        </w:tc>
+        <w:tc>
+          <w:tcPr>
+            <w:tcW w:type="dxa" w:w="3312"/>
+            <w:vAlign w:val="center"/>
+            <w:tcBorders>
+              <w:top w:val="single" w:sz="6" w:space="0" w:color="D9D9D9"/>
+              <w:left w:val="single" w:sz="6" w:space="0" w:color="D9D9D9"/>
+              <w:bottom w:val="single" w:sz="6" w:space="0" w:color="D9D9D9"/>
+              <w:right w:val="single" w:sz="6" w:space="0" w:color="D9D9D9"/>
+              <w:insideH w:val="single" w:sz="6" w:space="0" w:color="D9D9D9"/>
+              <w:insideV w:val="single" w:sz="6" w:space="0" w:color="D9D9D9"/>
+            </w:tcBorders>
+            <w:shd w:fill="17365D"/>
+          </w:tcPr>
+          <w:p>
+            <w:pPr>
+              <w:spacing w:after="0"/>
+            </w:pPr>
+            <w:r/>
+            <w:r>
+              <w:rPr>
+                <w:b/>
+                <w:color w:val="FFFFFF"/>
+                <w:sz w:val="18"/>
+              </w:rPr>
+              <w:t>Failure behavior</w:t>
+            </w:r>
+          </w:p>
+        </w:tc>
+      </w:tr>
+      <w:tr>
+        <w:tc>
+          <w:tcPr>
+            <w:tcW w:type="dxa" w:w="3312"/>
+            <w:vAlign w:val="center"/>
+            <w:tcBorders>
+              <w:top w:val="single" w:sz="6" w:space="0" w:color="D9D9D9"/>
+              <w:left w:val="single" w:sz="6" w:space="0" w:color="D9D9D9"/>
+              <w:bottom w:val="single" w:sz="6" w:space="0" w:color="D9D9D9"/>
+              <w:right w:val="single" w:sz="6" w:space="0" w:color="D9D9D9"/>
+              <w:insideH w:val="single" w:sz="6" w:space="0" w:color="D9D9D9"/>
+              <w:insideV w:val="single" w:sz="6" w:space="0" w:color="D9D9D9"/>
+            </w:tcBorders>
+          </w:tcPr>
+          <w:p>
+            <w:pPr>
+              <w:spacing w:after="0"/>
+            </w:pPr>
+            <w:r/>
+            <w:r>
+              <w:rPr>
+                <w:b w:val="0"/>
+                <w:sz w:val="18"/>
+              </w:rPr>
+              <w:t>Login</w:t>
+            </w:r>
+          </w:p>
+        </w:tc>
+        <w:tc>
+          <w:tcPr>
+            <w:tcW w:type="dxa" w:w="3312"/>
+            <w:vAlign w:val="center"/>
+            <w:tcBorders>
+              <w:top w:val="single" w:sz="6" w:space="0" w:color="D9D9D9"/>
+              <w:left w:val="single" w:sz="6" w:space="0" w:color="D9D9D9"/>
+              <w:bottom w:val="single" w:sz="6" w:space="0" w:color="D9D9D9"/>
+              <w:right w:val="single" w:sz="6" w:space="0" w:color="D9D9D9"/>
+              <w:insideH w:val="single" w:sz="6" w:space="0" w:color="D9D9D9"/>
+              <w:insideV w:val="single" w:sz="6" w:space="0" w:color="D9D9D9"/>
+            </w:tcBorders>
+          </w:tcPr>
+          <w:p>
+            <w:pPr>
+              <w:spacing w:after="0"/>
+            </w:pPr>
+            <w:r/>
+            <w:r>
+              <w:rPr>
+                <w:b w:val="0"/>
+                <w:sz w:val="18"/>
+              </w:rPr>
+              <w:t>Actor is resolved only from server-side session cookie</w:t>
+            </w:r>
+          </w:p>
+        </w:tc>
+        <w:tc>
+          <w:tcPr>
+            <w:tcW w:type="dxa" w:w="3312"/>
+            <w:vAlign w:val="center"/>
+            <w:tcBorders>
+              <w:top w:val="single" w:sz="6" w:space="0" w:color="D9D9D9"/>
+              <w:left w:val="single" w:sz="6" w:space="0" w:color="D9D9D9"/>
+              <w:bottom w:val="single" w:sz="6" w:space="0" w:color="D9D9D9"/>
+              <w:right w:val="single" w:sz="6" w:space="0" w:color="D9D9D9"/>
+              <w:insideH w:val="single" w:sz="6" w:space="0" w:color="D9D9D9"/>
+              <w:insideV w:val="single" w:sz="6" w:space="0" w:color="D9D9D9"/>
+            </w:tcBorders>
+          </w:tcPr>
+          <w:p>
+            <w:pPr>
+              <w:spacing w:after="0"/>
+            </w:pPr>
+            <w:r/>
+            <w:r>
+              <w:rPr>
+                <w:b w:val="0"/>
+                <w:sz w:val="18"/>
+              </w:rPr>
+              <w:t>401 and audit event</w:t>
+            </w:r>
+          </w:p>
+        </w:tc>
+      </w:tr>
+      <w:tr>
+        <w:tc>
+          <w:tcPr>
+            <w:tcW w:type="dxa" w:w="3312"/>
+            <w:vAlign w:val="center"/>
+            <w:tcBorders>
+              <w:top w:val="single" w:sz="6" w:space="0" w:color="D9D9D9"/>
+              <w:left w:val="single" w:sz="6" w:space="0" w:color="D9D9D9"/>
+              <w:bottom w:val="single" w:sz="6" w:space="0" w:color="D9D9D9"/>
+              <w:right w:val="single" w:sz="6" w:space="0" w:color="D9D9D9"/>
+              <w:insideH w:val="single" w:sz="6" w:space="0" w:color="D9D9D9"/>
+              <w:insideV w:val="single" w:sz="6" w:space="0" w:color="D9D9D9"/>
+            </w:tcBorders>
+            <w:shd w:fill="F3F5F7"/>
+          </w:tcPr>
+          <w:p>
+            <w:pPr>
+              <w:spacing w:after="0"/>
+            </w:pPr>
+            <w:r/>
+            <w:r>
+              <w:rPr>
+                <w:b w:val="0"/>
+                <w:sz w:val="18"/>
+              </w:rPr>
+              <w:t>Create</w:t>
+            </w:r>
+          </w:p>
+        </w:tc>
+        <w:tc>
+          <w:tcPr>
+            <w:tcW w:type="dxa" w:w="3312"/>
+            <w:vAlign w:val="center"/>
+            <w:tcBorders>
+              <w:top w:val="single" w:sz="6" w:space="0" w:color="D9D9D9"/>
+              <w:left w:val="single" w:sz="6" w:space="0" w:color="D9D9D9"/>
+              <w:bottom w:val="single" w:sz="6" w:space="0" w:color="D9D9D9"/>
+              <w:right w:val="single" w:sz="6" w:space="0" w:color="D9D9D9"/>
+              <w:insideH w:val="single" w:sz="6" w:space="0" w:color="D9D9D9"/>
+              <w:insideV w:val="single" w:sz="6" w:space="0" w:color="D9D9D9"/>
+            </w:tcBorders>
+            <w:shd w:fill="F3F5F7"/>
+          </w:tcPr>
+          <w:p>
+            <w:pPr>
+              <w:spacing w:after="0"/>
+            </w:pPr>
+            <w:r/>
+            <w:r>
+              <w:rPr>
+                <w:b w:val="0"/>
+                <w:sz w:val="18"/>
+              </w:rPr>
+              <w:t>Employee ID must belong to an active employee and amount/date/category must be valid</w:t>
+            </w:r>
+          </w:p>
+        </w:tc>
+        <w:tc>
+          <w:tcPr>
+            <w:tcW w:type="dxa" w:w="3312"/>
+            <w:vAlign w:val="center"/>
+            <w:tcBorders>
+              <w:top w:val="single" w:sz="6" w:space="0" w:color="D9D9D9"/>
+              <w:left w:val="single" w:sz="6" w:space="0" w:color="D9D9D9"/>
+              <w:bottom w:val="single" w:sz="6" w:space="0" w:color="D9D9D9"/>
+              <w:right w:val="single" w:sz="6" w:space="0" w:color="D9D9D9"/>
+              <w:insideH w:val="single" w:sz="6" w:space="0" w:color="D9D9D9"/>
+              <w:insideV w:val="single" w:sz="6" w:space="0" w:color="D9D9D9"/>
+            </w:tcBorders>
+            <w:shd w:fill="F3F5F7"/>
+          </w:tcPr>
+          <w:p>
+            <w:pPr>
+              <w:spacing w:after="0"/>
+            </w:pPr>
+            <w:r/>
+            <w:r>
+              <w:rPr>
+                <w:b w:val="0"/>
+                <w:sz w:val="18"/>
+              </w:rPr>
+              <w:t>400 or 403</w:t>
+            </w:r>
+          </w:p>
+        </w:tc>
+      </w:tr>
+      <w:tr>
+        <w:tc>
+          <w:tcPr>
+            <w:tcW w:type="dxa" w:w="3312"/>
+            <w:vAlign w:val="center"/>
+            <w:tcBorders>
+              <w:top w:val="single" w:sz="6" w:space="0" w:color="D9D9D9"/>
+              <w:left w:val="single" w:sz="6" w:space="0" w:color="D9D9D9"/>
+              <w:bottom w:val="single" w:sz="6" w:space="0" w:color="D9D9D9"/>
+              <w:right w:val="single" w:sz="6" w:space="0" w:color="D9D9D9"/>
+              <w:insideH w:val="single" w:sz="6" w:space="0" w:color="D9D9D9"/>
+              <w:insideV w:val="single" w:sz="6" w:space="0" w:color="D9D9D9"/>
+            </w:tcBorders>
+          </w:tcPr>
+          <w:p>
+            <w:pPr>
+              <w:spacing w:after="0"/>
+            </w:pPr>
+            <w:r/>
+            <w:r>
+              <w:rPr>
+                <w:b w:val="0"/>
+                <w:sz w:val="18"/>
+              </w:rPr>
+              <w:t>Submit</w:t>
+            </w:r>
+          </w:p>
+        </w:tc>
+        <w:tc>
+          <w:tcPr>
+            <w:tcW w:type="dxa" w:w="3312"/>
+            <w:vAlign w:val="center"/>
+            <w:tcBorders>
+              <w:top w:val="single" w:sz="6" w:space="0" w:color="D9D9D9"/>
+              <w:left w:val="single" w:sz="6" w:space="0" w:color="D9D9D9"/>
+              <w:bottom w:val="single" w:sz="6" w:space="0" w:color="D9D9D9"/>
+              <w:right w:val="single" w:sz="6" w:space="0" w:color="D9D9D9"/>
+              <w:insideH w:val="single" w:sz="6" w:space="0" w:color="D9D9D9"/>
+              <w:insideV w:val="single" w:sz="6" w:space="0" w:color="D9D9D9"/>
+            </w:tcBorders>
+          </w:tcPr>
+          <w:p>
+            <w:pPr>
+              <w:spacing w:after="0"/>
+            </w:pPr>
+            <w:r/>
+            <w:r>
+              <w:rPr>
+                <w:b w:val="0"/>
+                <w:sz w:val="18"/>
+              </w:rPr>
+              <w:t>Only owner or authorized finance role can submit a draft</w:t>
+            </w:r>
+          </w:p>
+        </w:tc>
+        <w:tc>
+          <w:tcPr>
+            <w:tcW w:type="dxa" w:w="3312"/>
+            <w:vAlign w:val="center"/>
+            <w:tcBorders>
+              <w:top w:val="single" w:sz="6" w:space="0" w:color="D9D9D9"/>
+              <w:left w:val="single" w:sz="6" w:space="0" w:color="D9D9D9"/>
+              <w:bottom w:val="single" w:sz="6" w:space="0" w:color="D9D9D9"/>
+              <w:right w:val="single" w:sz="6" w:space="0" w:color="D9D9D9"/>
+              <w:insideH w:val="single" w:sz="6" w:space="0" w:color="D9D9D9"/>
+              <w:insideV w:val="single" w:sz="6" w:space="0" w:color="D9D9D9"/>
+            </w:tcBorders>
+          </w:tcPr>
+          <w:p>
+            <w:pPr>
+              <w:spacing w:after="0"/>
+            </w:pPr>
+            <w:r/>
+            <w:r>
+              <w:rPr>
+                <w:b w:val="0"/>
+                <w:sz w:val="18"/>
+              </w:rPr>
+              <w:t>403 or 409</w:t>
+            </w:r>
+          </w:p>
+        </w:tc>
+      </w:tr>
+      <w:tr>
+        <w:tc>
+          <w:tcPr>
+            <w:tcW w:type="dxa" w:w="3312"/>
+            <w:vAlign w:val="center"/>
+            <w:tcBorders>
+              <w:top w:val="single" w:sz="6" w:space="0" w:color="D9D9D9"/>
+              <w:left w:val="single" w:sz="6" w:space="0" w:color="D9D9D9"/>
+              <w:bottom w:val="single" w:sz="6" w:space="0" w:color="D9D9D9"/>
+              <w:right w:val="single" w:sz="6" w:space="0" w:color="D9D9D9"/>
+              <w:insideH w:val="single" w:sz="6" w:space="0" w:color="D9D9D9"/>
+              <w:insideV w:val="single" w:sz="6" w:space="0" w:color="D9D9D9"/>
+            </w:tcBorders>
+            <w:shd w:fill="F3F5F7"/>
+          </w:tcPr>
+          <w:p>
+            <w:pPr>
+              <w:spacing w:after="0"/>
+            </w:pPr>
+            <w:r/>
+            <w:r>
+              <w:rPr>
+                <w:b w:val="0"/>
+                <w:sz w:val="18"/>
+              </w:rPr>
+              <w:t>Approve/reject</w:t>
+            </w:r>
+          </w:p>
+        </w:tc>
+        <w:tc>
+          <w:tcPr>
+            <w:tcW w:type="dxa" w:w="3312"/>
+            <w:vAlign w:val="center"/>
+            <w:tcBorders>
+              <w:top w:val="single" w:sz="6" w:space="0" w:color="D9D9D9"/>
+              <w:left w:val="single" w:sz="6" w:space="0" w:color="D9D9D9"/>
+              <w:bottom w:val="single" w:sz="6" w:space="0" w:color="D9D9D9"/>
+              <w:right w:val="single" w:sz="6" w:space="0" w:color="D9D9D9"/>
+              <w:insideH w:val="single" w:sz="6" w:space="0" w:color="D9D9D9"/>
+              <w:insideV w:val="single" w:sz="6" w:space="0" w:color="D9D9D9"/>
+            </w:tcBorders>
+            <w:shd w:fill="F3F5F7"/>
+          </w:tcPr>
+          <w:p>
+            <w:pPr>
+              <w:spacing w:after="0"/>
+            </w:pPr>
+            <w:r/>
+            <w:r>
+              <w:rPr>
+                <w:b w:val="0"/>
+                <w:sz w:val="18"/>
+              </w:rPr>
+              <w:t>Only assigned manager may review; self-approval denied; rejection reason required</w:t>
+            </w:r>
+          </w:p>
+        </w:tc>
+        <w:tc>
+          <w:tcPr>
+            <w:tcW w:type="dxa" w:w="3312"/>
+            <w:vAlign w:val="center"/>
+            <w:tcBorders>
+              <w:top w:val="single" w:sz="6" w:space="0" w:color="D9D9D9"/>
+              <w:left w:val="single" w:sz="6" w:space="0" w:color="D9D9D9"/>
+              <w:bottom w:val="single" w:sz="6" w:space="0" w:color="D9D9D9"/>
+              <w:right w:val="single" w:sz="6" w:space="0" w:color="D9D9D9"/>
+              <w:insideH w:val="single" w:sz="6" w:space="0" w:color="D9D9D9"/>
+              <w:insideV w:val="single" w:sz="6" w:space="0" w:color="D9D9D9"/>
+            </w:tcBorders>
+            <w:shd w:fill="F3F5F7"/>
+          </w:tcPr>
+          <w:p>
+            <w:pPr>
+              <w:spacing w:after="0"/>
+            </w:pPr>
+            <w:r/>
+            <w:r>
+              <w:rPr>
+                <w:b w:val="0"/>
+                <w:sz w:val="18"/>
+              </w:rPr>
+              <w:t>403 or 400</w:t>
+            </w:r>
+          </w:p>
+        </w:tc>
+      </w:tr>
+      <w:tr>
+        <w:tc>
+          <w:tcPr>
+            <w:tcW w:type="dxa" w:w="3312"/>
+            <w:vAlign w:val="center"/>
+            <w:tcBorders>
+              <w:top w:val="single" w:sz="6" w:space="0" w:color="D9D9D9"/>
+              <w:left w:val="single" w:sz="6" w:space="0" w:color="D9D9D9"/>
+              <w:bottom w:val="single" w:sz="6" w:space="0" w:color="D9D9D9"/>
+              <w:right w:val="single" w:sz="6" w:space="0" w:color="D9D9D9"/>
+              <w:insideH w:val="single" w:sz="6" w:space="0" w:color="D9D9D9"/>
+              <w:insideV w:val="single" w:sz="6" w:space="0" w:color="D9D9D9"/>
+            </w:tcBorders>
+          </w:tcPr>
+          <w:p>
+            <w:pPr>
+              <w:spacing w:after="0"/>
+            </w:pPr>
+            <w:r/>
+            <w:r>
+              <w:rPr>
+                <w:b w:val="0"/>
+                <w:sz w:val="18"/>
+              </w:rPr>
+              <w:t>Post</w:t>
+            </w:r>
+          </w:p>
+        </w:tc>
+        <w:tc>
+          <w:tcPr>
+            <w:tcW w:type="dxa" w:w="3312"/>
+            <w:vAlign w:val="center"/>
+            <w:tcBorders>
+              <w:top w:val="single" w:sz="6" w:space="0" w:color="D9D9D9"/>
+              <w:left w:val="single" w:sz="6" w:space="0" w:color="D9D9D9"/>
+              <w:bottom w:val="single" w:sz="6" w:space="0" w:color="D9D9D9"/>
+              <w:right w:val="single" w:sz="6" w:space="0" w:color="D9D9D9"/>
+              <w:insideH w:val="single" w:sz="6" w:space="0" w:color="D9D9D9"/>
+              <w:insideV w:val="single" w:sz="6" w:space="0" w:color="D9D9D9"/>
+            </w:tcBorders>
+          </w:tcPr>
+          <w:p>
+            <w:pPr>
+              <w:spacing w:after="0"/>
+            </w:pPr>
+            <w:r/>
+            <w:r>
+              <w:rPr>
+                <w:b w:val="0"/>
+                <w:sz w:val="18"/>
+              </w:rPr>
+              <w:t>Only finance roles may post Approved records; transaction ID is idempotent</w:t>
+            </w:r>
+          </w:p>
+        </w:tc>
+        <w:tc>
+          <w:tcPr>
+            <w:tcW w:type="dxa" w:w="3312"/>
+            <w:vAlign w:val="center"/>
+            <w:tcBorders>
+              <w:top w:val="single" w:sz="6" w:space="0" w:color="D9D9D9"/>
+              <w:left w:val="single" w:sz="6" w:space="0" w:color="D9D9D9"/>
+              <w:bottom w:val="single" w:sz="6" w:space="0" w:color="D9D9D9"/>
+              <w:right w:val="single" w:sz="6" w:space="0" w:color="D9D9D9"/>
+              <w:insideH w:val="single" w:sz="6" w:space="0" w:color="D9D9D9"/>
+              <w:insideV w:val="single" w:sz="6" w:space="0" w:color="D9D9D9"/>
+            </w:tcBorders>
+          </w:tcPr>
+          <w:p>
+            <w:pPr>
+              <w:spacing w:after="0"/>
+            </w:pPr>
+            <w:r/>
+            <w:r>
+              <w:rPr>
+                <w:b w:val="0"/>
+                <w:sz w:val="18"/>
+              </w:rPr>
+              <w:t>409 on duplicate or invalid state</w:t>
+            </w:r>
+          </w:p>
+        </w:tc>
+      </w:tr>
+    </w:tbl>
+    <w:p>
+      <w:pPr>
+        <w:spacing w:after="20"/>
+      </w:pPr>
+    </w:p>
+    <w:p>
+      <w:pPr>
+        <w:pStyle w:val="Heading2"/>
+        <w:keepNext/>
+      </w:pPr>
+      <w:r>
+        <w:t>Module 3 FastAPI Mainframe Bridge</w:t>
+      </w:r>
+    </w:p>
+    <w:p>
+      <w:r>
+        <w:t>FastAPI is the controlled live integration service. It validates the API schema, collects approved expenses into a batch, serializes all records into FB80 host-text lines, allocates one unique transaction dataset, uploads the batch, submits one EXPPOST JCL job, polls JES status, reads the batch-specific result dataset, matches every result by expense ID, and refreshes EXPRPT once when posting succeeds. The service returns unavailable or failed when the mainframe prerequisites are missing; it never substitutes a local success record.</w:t>
+      </w:r>
+    </w:p>
+    <w:p>
+      <w:pPr>
+        <w:pStyle w:val="CodeBlock"/>
+      </w:pPr>
+      <w:r>
+        <w:t>approved expenses</w:t>
+        <w:br/>
+        <w:t xml:space="preserve">  -&gt; create one batch ID</w:t>
+        <w:br/>
+        <w:t xml:space="preserve">  -&gt; serialize multiple FB80 records</w:t>
+        <w:br/>
+        <w:t xml:space="preserve">  -&gt; allocate Z86073.EXPTRK.TXN.&lt;batch&gt;</w:t>
+        <w:br/>
+        <w:t xml:space="preserve">  -&gt; upload one batch file</w:t>
+        <w:br/>
+        <w:t xml:space="preserve">  -&gt; submit one EXPPOST job</w:t>
+        <w:br/>
+        <w:t xml:space="preserve">  -&gt; read Z86073.EXPTRK.RES.&lt;batch&gt;</w:t>
+        <w:br/>
+        <w:t xml:space="preserve">  -&gt; match each RESULT record by expense ID</w:t>
+        <w:br/>
+        <w:t xml:space="preserve">  -&gt; run EXPRPT and EXPMON</w:t>
+        <w:br/>
+        <w:t xml:space="preserve">  -&gt; return individual posted/rejected/failed states</w:t>
+      </w:r>
+    </w:p>
+    <w:p>
+      <w:pPr>
+        <w:pStyle w:val="Heading2"/>
+        <w:keepNext/>
+      </w:pPr>
+      <w:r>
+        <w:t>Module 4 Fixed Width Batch Simulator</w:t>
+      </w:r>
+    </w:p>
+    <w:p>
+      <w:r>
+        <w:t>The local simulator demonstrates the same class of batch controls without connecting to z/OS. It reads data/EXPENSE.TRANS, rejects malformed records that are not exactly 80 printable single-byte characters, removes exact duplicates, matches employee IDs against EMPLOYEE.MASTER, validates date/category/amount fields, creates exception records, calculates category and monthly totals, performs a count check, and retains the report only when counts match.</w:t>
+      </w:r>
+    </w:p>
+    <w:tbl>
+      <w:tblPr>
+        <w:tblStyle w:val="TableGrid"/>
+        <w:tblW w:type="auto" w:w="0"/>
+        <w:jc w:val="center"/>
+        <w:tblLook w:firstColumn="1" w:firstRow="1" w:lastColumn="0" w:lastRow="0" w:noHBand="0" w:noVBand="1" w:val="04A0"/>
+      </w:tblPr>
+      <w:tblGrid>
+        <w:gridCol w:w="3312"/>
+        <w:gridCol w:w="3312"/>
+        <w:gridCol w:w="3312"/>
+      </w:tblGrid>
+      <w:tr>
+        <w:tc>
+          <w:tcPr>
+            <w:tcW w:type="dxa" w:w="3312"/>
+            <w:vAlign w:val="center"/>
+            <w:tcBorders>
+              <w:top w:val="single" w:sz="6" w:space="0" w:color="D9D9D9"/>
+              <w:left w:val="single" w:sz="6" w:space="0" w:color="D9D9D9"/>
+              <w:bottom w:val="single" w:sz="6" w:space="0" w:color="D9D9D9"/>
+              <w:right w:val="single" w:sz="6" w:space="0" w:color="D9D9D9"/>
+              <w:insideH w:val="single" w:sz="6" w:space="0" w:color="D9D9D9"/>
+              <w:insideV w:val="single" w:sz="6" w:space="0" w:color="D9D9D9"/>
+            </w:tcBorders>
+            <w:shd w:fill="17365D"/>
+          </w:tcPr>
+          <w:p>
+            <w:pPr>
+              <w:spacing w:after="0"/>
+            </w:pPr>
+            <w:r/>
+            <w:r>
+              <w:rPr>
+                <w:b/>
+                <w:color w:val="FFFFFF"/>
+                <w:sz w:val="18"/>
+              </w:rPr>
+              <w:t>Step</w:t>
+            </w:r>
+          </w:p>
+        </w:tc>
+        <w:tc>
+          <w:tcPr>
+            <w:tcW w:type="dxa" w:w="3312"/>
+            <w:vAlign w:val="center"/>
+            <w:tcBorders>
+              <w:top w:val="single" w:sz="6" w:space="0" w:color="D9D9D9"/>
+              <w:left w:val="single" w:sz="6" w:space="0" w:color="D9D9D9"/>
+              <w:bottom w:val="single" w:sz="6" w:space="0" w:color="D9D9D9"/>
+              <w:right w:val="single" w:sz="6" w:space="0" w:color="D9D9D9"/>
+              <w:insideH w:val="single" w:sz="6" w:space="0" w:color="D9D9D9"/>
+              <w:insideV w:val="single" w:sz="6" w:space="0" w:color="D9D9D9"/>
+            </w:tcBorders>
+            <w:shd w:fill="17365D"/>
+          </w:tcPr>
+          <w:p>
+            <w:pPr>
+              <w:spacing w:after="0"/>
+            </w:pPr>
+            <w:r/>
+            <w:r>
+              <w:rPr>
+                <w:b/>
+                <w:color w:val="FFFFFF"/>
+                <w:sz w:val="18"/>
+              </w:rPr>
+              <w:t>Input</w:t>
+            </w:r>
+          </w:p>
+        </w:tc>
+        <w:tc>
+          <w:tcPr>
+            <w:tcW w:type="dxa" w:w="3312"/>
+            <w:vAlign w:val="center"/>
+            <w:tcBorders>
+              <w:top w:val="single" w:sz="6" w:space="0" w:color="D9D9D9"/>
+              <w:left w:val="single" w:sz="6" w:space="0" w:color="D9D9D9"/>
+              <w:bottom w:val="single" w:sz="6" w:space="0" w:color="D9D9D9"/>
+              <w:right w:val="single" w:sz="6" w:space="0" w:color="D9D9D9"/>
+              <w:insideH w:val="single" w:sz="6" w:space="0" w:color="D9D9D9"/>
+              <w:insideV w:val="single" w:sz="6" w:space="0" w:color="D9D9D9"/>
+            </w:tcBorders>
+            <w:shd w:fill="17365D"/>
+          </w:tcPr>
+          <w:p>
+            <w:pPr>
+              <w:spacing w:after="0"/>
+            </w:pPr>
+            <w:r/>
+            <w:r>
+              <w:rPr>
+                <w:b/>
+                <w:color w:val="FFFFFF"/>
+                <w:sz w:val="18"/>
+              </w:rPr>
+              <w:t>Output</w:t>
+            </w:r>
+          </w:p>
+        </w:tc>
+      </w:tr>
+      <w:tr>
+        <w:tc>
+          <w:tcPr>
+            <w:tcW w:type="dxa" w:w="3312"/>
+            <w:vAlign w:val="center"/>
+            <w:tcBorders>
+              <w:top w:val="single" w:sz="6" w:space="0" w:color="D9D9D9"/>
+              <w:left w:val="single" w:sz="6" w:space="0" w:color="D9D9D9"/>
+              <w:bottom w:val="single" w:sz="6" w:space="0" w:color="D9D9D9"/>
+              <w:right w:val="single" w:sz="6" w:space="0" w:color="D9D9D9"/>
+              <w:insideH w:val="single" w:sz="6" w:space="0" w:color="D9D9D9"/>
+              <w:insideV w:val="single" w:sz="6" w:space="0" w:color="D9D9D9"/>
+            </w:tcBorders>
+          </w:tcPr>
+          <w:p>
+            <w:pPr>
+              <w:spacing w:after="0"/>
+            </w:pPr>
+            <w:r/>
+            <w:r>
+              <w:rPr>
+                <w:b w:val="0"/>
+                <w:sz w:val="18"/>
+              </w:rPr>
+              <w:t>Read</w:t>
+            </w:r>
+          </w:p>
+        </w:tc>
+        <w:tc>
+          <w:tcPr>
+            <w:tcW w:type="dxa" w:w="3312"/>
+            <w:vAlign w:val="center"/>
+            <w:tcBorders>
+              <w:top w:val="single" w:sz="6" w:space="0" w:color="D9D9D9"/>
+              <w:left w:val="single" w:sz="6" w:space="0" w:color="D9D9D9"/>
+              <w:bottom w:val="single" w:sz="6" w:space="0" w:color="D9D9D9"/>
+              <w:right w:val="single" w:sz="6" w:space="0" w:color="D9D9D9"/>
+              <w:insideH w:val="single" w:sz="6" w:space="0" w:color="D9D9D9"/>
+              <w:insideV w:val="single" w:sz="6" w:space="0" w:color="D9D9D9"/>
+            </w:tcBorders>
+          </w:tcPr>
+          <w:p>
+            <w:pPr>
+              <w:spacing w:after="0"/>
+            </w:pPr>
+            <w:r/>
+            <w:r>
+              <w:rPr>
+                <w:b w:val="0"/>
+                <w:sz w:val="18"/>
+              </w:rPr>
+              <w:t>EXPENSE.TRANS</w:t>
+            </w:r>
+          </w:p>
+        </w:tc>
+        <w:tc>
+          <w:tcPr>
+            <w:tcW w:type="dxa" w:w="3312"/>
+            <w:vAlign w:val="center"/>
+            <w:tcBorders>
+              <w:top w:val="single" w:sz="6" w:space="0" w:color="D9D9D9"/>
+              <w:left w:val="single" w:sz="6" w:space="0" w:color="D9D9D9"/>
+              <w:bottom w:val="single" w:sz="6" w:space="0" w:color="D9D9D9"/>
+              <w:right w:val="single" w:sz="6" w:space="0" w:color="D9D9D9"/>
+              <w:insideH w:val="single" w:sz="6" w:space="0" w:color="D9D9D9"/>
+              <w:insideV w:val="single" w:sz="6" w:space="0" w:color="D9D9D9"/>
+            </w:tcBorders>
+          </w:tcPr>
+          <w:p>
+            <w:pPr>
+              <w:spacing w:after="0"/>
+            </w:pPr>
+            <w:r/>
+            <w:r>
+              <w:rPr>
+                <w:b w:val="0"/>
+                <w:sz w:val="18"/>
+              </w:rPr>
+              <w:t>Raw count and malformed records</w:t>
+            </w:r>
+          </w:p>
+        </w:tc>
+      </w:tr>
+      <w:tr>
+        <w:tc>
+          <w:tcPr>
+            <w:tcW w:type="dxa" w:w="3312"/>
+            <w:vAlign w:val="center"/>
+            <w:tcBorders>
+              <w:top w:val="single" w:sz="6" w:space="0" w:color="D9D9D9"/>
+              <w:left w:val="single" w:sz="6" w:space="0" w:color="D9D9D9"/>
+              <w:bottom w:val="single" w:sz="6" w:space="0" w:color="D9D9D9"/>
+              <w:right w:val="single" w:sz="6" w:space="0" w:color="D9D9D9"/>
+              <w:insideH w:val="single" w:sz="6" w:space="0" w:color="D9D9D9"/>
+              <w:insideV w:val="single" w:sz="6" w:space="0" w:color="D9D9D9"/>
+            </w:tcBorders>
+            <w:shd w:fill="F3F5F7"/>
+          </w:tcPr>
+          <w:p>
+            <w:pPr>
+              <w:spacing w:after="0"/>
+            </w:pPr>
+            <w:r/>
+            <w:r>
+              <w:rPr>
+                <w:b w:val="0"/>
+                <w:sz w:val="18"/>
+              </w:rPr>
+              <w:t>Deduplicate</w:t>
+            </w:r>
+          </w:p>
+        </w:tc>
+        <w:tc>
+          <w:tcPr>
+            <w:tcW w:type="dxa" w:w="3312"/>
+            <w:vAlign w:val="center"/>
+            <w:tcBorders>
+              <w:top w:val="single" w:sz="6" w:space="0" w:color="D9D9D9"/>
+              <w:left w:val="single" w:sz="6" w:space="0" w:color="D9D9D9"/>
+              <w:bottom w:val="single" w:sz="6" w:space="0" w:color="D9D9D9"/>
+              <w:right w:val="single" w:sz="6" w:space="0" w:color="D9D9D9"/>
+              <w:insideH w:val="single" w:sz="6" w:space="0" w:color="D9D9D9"/>
+              <w:insideV w:val="single" w:sz="6" w:space="0" w:color="D9D9D9"/>
+            </w:tcBorders>
+            <w:shd w:fill="F3F5F7"/>
+          </w:tcPr>
+          <w:p>
+            <w:pPr>
+              <w:spacing w:after="0"/>
+            </w:pPr>
+            <w:r/>
+            <w:r>
+              <w:rPr>
+                <w:b w:val="0"/>
+                <w:sz w:val="18"/>
+              </w:rPr>
+              <w:t>80-byte transaction records</w:t>
+            </w:r>
+          </w:p>
+        </w:tc>
+        <w:tc>
+          <w:tcPr>
+            <w:tcW w:type="dxa" w:w="3312"/>
+            <w:vAlign w:val="center"/>
+            <w:tcBorders>
+              <w:top w:val="single" w:sz="6" w:space="0" w:color="D9D9D9"/>
+              <w:left w:val="single" w:sz="6" w:space="0" w:color="D9D9D9"/>
+              <w:bottom w:val="single" w:sz="6" w:space="0" w:color="D9D9D9"/>
+              <w:right w:val="single" w:sz="6" w:space="0" w:color="D9D9D9"/>
+              <w:insideH w:val="single" w:sz="6" w:space="0" w:color="D9D9D9"/>
+              <w:insideV w:val="single" w:sz="6" w:space="0" w:color="D9D9D9"/>
+            </w:tcBorders>
+            <w:shd w:fill="F3F5F7"/>
+          </w:tcPr>
+          <w:p>
+            <w:pPr>
+              <w:spacing w:after="0"/>
+            </w:pPr>
+            <w:r/>
+            <w:r>
+              <w:rPr>
+                <w:b w:val="0"/>
+                <w:sz w:val="18"/>
+              </w:rPr>
+              <w:t>EXPENSE.DUPS and EXPENSE.CLEAN</w:t>
+            </w:r>
+          </w:p>
+        </w:tc>
+      </w:tr>
+      <w:tr>
+        <w:tc>
+          <w:tcPr>
+            <w:tcW w:type="dxa" w:w="3312"/>
+            <w:vAlign w:val="center"/>
+            <w:tcBorders>
+              <w:top w:val="single" w:sz="6" w:space="0" w:color="D9D9D9"/>
+              <w:left w:val="single" w:sz="6" w:space="0" w:color="D9D9D9"/>
+              <w:bottom w:val="single" w:sz="6" w:space="0" w:color="D9D9D9"/>
+              <w:right w:val="single" w:sz="6" w:space="0" w:color="D9D9D9"/>
+              <w:insideH w:val="single" w:sz="6" w:space="0" w:color="D9D9D9"/>
+              <w:insideV w:val="single" w:sz="6" w:space="0" w:color="D9D9D9"/>
+            </w:tcBorders>
+          </w:tcPr>
+          <w:p>
+            <w:pPr>
+              <w:spacing w:after="0"/>
+            </w:pPr>
+            <w:r/>
+            <w:r>
+              <w:rPr>
+                <w:b w:val="0"/>
+                <w:sz w:val="18"/>
+              </w:rPr>
+              <w:t>Match</w:t>
+            </w:r>
+          </w:p>
+        </w:tc>
+        <w:tc>
+          <w:tcPr>
+            <w:tcW w:type="dxa" w:w="3312"/>
+            <w:vAlign w:val="center"/>
+            <w:tcBorders>
+              <w:top w:val="single" w:sz="6" w:space="0" w:color="D9D9D9"/>
+              <w:left w:val="single" w:sz="6" w:space="0" w:color="D9D9D9"/>
+              <w:bottom w:val="single" w:sz="6" w:space="0" w:color="D9D9D9"/>
+              <w:right w:val="single" w:sz="6" w:space="0" w:color="D9D9D9"/>
+              <w:insideH w:val="single" w:sz="6" w:space="0" w:color="D9D9D9"/>
+              <w:insideV w:val="single" w:sz="6" w:space="0" w:color="D9D9D9"/>
+            </w:tcBorders>
+          </w:tcPr>
+          <w:p>
+            <w:pPr>
+              <w:spacing w:after="0"/>
+            </w:pPr>
+            <w:r/>
+            <w:r>
+              <w:rPr>
+                <w:b w:val="0"/>
+                <w:sz w:val="18"/>
+              </w:rPr>
+              <w:t>Employee key bytes 13-20 and EMPLOYEE.MASTER</w:t>
+            </w:r>
+          </w:p>
+        </w:tc>
+        <w:tc>
+          <w:tcPr>
+            <w:tcW w:type="dxa" w:w="3312"/>
+            <w:vAlign w:val="center"/>
+            <w:tcBorders>
+              <w:top w:val="single" w:sz="6" w:space="0" w:color="D9D9D9"/>
+              <w:left w:val="single" w:sz="6" w:space="0" w:color="D9D9D9"/>
+              <w:bottom w:val="single" w:sz="6" w:space="0" w:color="D9D9D9"/>
+              <w:right w:val="single" w:sz="6" w:space="0" w:color="D9D9D9"/>
+              <w:insideH w:val="single" w:sz="6" w:space="0" w:color="D9D9D9"/>
+              <w:insideV w:val="single" w:sz="6" w:space="0" w:color="D9D9D9"/>
+            </w:tcBorders>
+          </w:tcPr>
+          <w:p>
+            <w:pPr>
+              <w:spacing w:after="0"/>
+            </w:pPr>
+            <w:r/>
+            <w:r>
+              <w:rPr>
+                <w:b w:val="0"/>
+                <w:sz w:val="18"/>
+              </w:rPr>
+              <w:t>Matched records and unknown-employee exceptions</w:t>
+            </w:r>
+          </w:p>
+        </w:tc>
+      </w:tr>
+      <w:tr>
+        <w:tc>
+          <w:tcPr>
+            <w:tcW w:type="dxa" w:w="3312"/>
+            <w:vAlign w:val="center"/>
+            <w:tcBorders>
+              <w:top w:val="single" w:sz="6" w:space="0" w:color="D9D9D9"/>
+              <w:left w:val="single" w:sz="6" w:space="0" w:color="D9D9D9"/>
+              <w:bottom w:val="single" w:sz="6" w:space="0" w:color="D9D9D9"/>
+              <w:right w:val="single" w:sz="6" w:space="0" w:color="D9D9D9"/>
+              <w:insideH w:val="single" w:sz="6" w:space="0" w:color="D9D9D9"/>
+              <w:insideV w:val="single" w:sz="6" w:space="0" w:color="D9D9D9"/>
+            </w:tcBorders>
+            <w:shd w:fill="F3F5F7"/>
+          </w:tcPr>
+          <w:p>
+            <w:pPr>
+              <w:spacing w:after="0"/>
+            </w:pPr>
+            <w:r/>
+            <w:r>
+              <w:rPr>
+                <w:b w:val="0"/>
+                <w:sz w:val="18"/>
+              </w:rPr>
+              <w:t>Validate</w:t>
+            </w:r>
+          </w:p>
+        </w:tc>
+        <w:tc>
+          <w:tcPr>
+            <w:tcW w:type="dxa" w:w="3312"/>
+            <w:vAlign w:val="center"/>
+            <w:tcBorders>
+              <w:top w:val="single" w:sz="6" w:space="0" w:color="D9D9D9"/>
+              <w:left w:val="single" w:sz="6" w:space="0" w:color="D9D9D9"/>
+              <w:bottom w:val="single" w:sz="6" w:space="0" w:color="D9D9D9"/>
+              <w:right w:val="single" w:sz="6" w:space="0" w:color="D9D9D9"/>
+              <w:insideH w:val="single" w:sz="6" w:space="0" w:color="D9D9D9"/>
+              <w:insideV w:val="single" w:sz="6" w:space="0" w:color="D9D9D9"/>
+            </w:tcBorders>
+            <w:shd w:fill="F3F5F7"/>
+          </w:tcPr>
+          <w:p>
+            <w:pPr>
+              <w:spacing w:after="0"/>
+            </w:pPr>
+            <w:r/>
+            <w:r>
+              <w:rPr>
+                <w:b w:val="0"/>
+                <w:sz w:val="18"/>
+              </w:rPr>
+              <w:t>Date, category, amount</w:t>
+            </w:r>
+          </w:p>
+        </w:tc>
+        <w:tc>
+          <w:tcPr>
+            <w:tcW w:type="dxa" w:w="3312"/>
+            <w:vAlign w:val="center"/>
+            <w:tcBorders>
+              <w:top w:val="single" w:sz="6" w:space="0" w:color="D9D9D9"/>
+              <w:left w:val="single" w:sz="6" w:space="0" w:color="D9D9D9"/>
+              <w:bottom w:val="single" w:sz="6" w:space="0" w:color="D9D9D9"/>
+              <w:right w:val="single" w:sz="6" w:space="0" w:color="D9D9D9"/>
+              <w:insideH w:val="single" w:sz="6" w:space="0" w:color="D9D9D9"/>
+              <w:insideV w:val="single" w:sz="6" w:space="0" w:color="D9D9D9"/>
+            </w:tcBorders>
+            <w:shd w:fill="F3F5F7"/>
+          </w:tcPr>
+          <w:p>
+            <w:pPr>
+              <w:spacing w:after="0"/>
+            </w:pPr>
+            <w:r/>
+            <w:r>
+              <w:rPr>
+                <w:b w:val="0"/>
+                <w:sz w:val="18"/>
+              </w:rPr>
+              <w:t>EXPENSE.VALID and EXPENSE.REJECT</w:t>
+            </w:r>
+          </w:p>
+        </w:tc>
+      </w:tr>
+      <w:tr>
+        <w:tc>
+          <w:tcPr>
+            <w:tcW w:type="dxa" w:w="3312"/>
+            <w:vAlign w:val="center"/>
+            <w:tcBorders>
+              <w:top w:val="single" w:sz="6" w:space="0" w:color="D9D9D9"/>
+              <w:left w:val="single" w:sz="6" w:space="0" w:color="D9D9D9"/>
+              <w:bottom w:val="single" w:sz="6" w:space="0" w:color="D9D9D9"/>
+              <w:right w:val="single" w:sz="6" w:space="0" w:color="D9D9D9"/>
+              <w:insideH w:val="single" w:sz="6" w:space="0" w:color="D9D9D9"/>
+              <w:insideV w:val="single" w:sz="6" w:space="0" w:color="D9D9D9"/>
+            </w:tcBorders>
+          </w:tcPr>
+          <w:p>
+            <w:pPr>
+              <w:spacing w:after="0"/>
+            </w:pPr>
+            <w:r/>
+            <w:r>
+              <w:rPr>
+                <w:b w:val="0"/>
+                <w:sz w:val="18"/>
+              </w:rPr>
+              <w:t>Report</w:t>
+            </w:r>
+          </w:p>
+        </w:tc>
+        <w:tc>
+          <w:tcPr>
+            <w:tcW w:type="dxa" w:w="3312"/>
+            <w:vAlign w:val="center"/>
+            <w:tcBorders>
+              <w:top w:val="single" w:sz="6" w:space="0" w:color="D9D9D9"/>
+              <w:left w:val="single" w:sz="6" w:space="0" w:color="D9D9D9"/>
+              <w:bottom w:val="single" w:sz="6" w:space="0" w:color="D9D9D9"/>
+              <w:right w:val="single" w:sz="6" w:space="0" w:color="D9D9D9"/>
+              <w:insideH w:val="single" w:sz="6" w:space="0" w:color="D9D9D9"/>
+              <w:insideV w:val="single" w:sz="6" w:space="0" w:color="D9D9D9"/>
+            </w:tcBorders>
+          </w:tcPr>
+          <w:p>
+            <w:pPr>
+              <w:spacing w:after="0"/>
+            </w:pPr>
+            <w:r/>
+            <w:r>
+              <w:rPr>
+                <w:b w:val="0"/>
+                <w:sz w:val="18"/>
+              </w:rPr>
+              <w:t>Valid sorted records</w:t>
+            </w:r>
+          </w:p>
+        </w:tc>
+        <w:tc>
+          <w:tcPr>
+            <w:tcW w:type="dxa" w:w="3312"/>
+            <w:vAlign w:val="center"/>
+            <w:tcBorders>
+              <w:top w:val="single" w:sz="6" w:space="0" w:color="D9D9D9"/>
+              <w:left w:val="single" w:sz="6" w:space="0" w:color="D9D9D9"/>
+              <w:bottom w:val="single" w:sz="6" w:space="0" w:color="D9D9D9"/>
+              <w:right w:val="single" w:sz="6" w:space="0" w:color="D9D9D9"/>
+              <w:insideH w:val="single" w:sz="6" w:space="0" w:color="D9D9D9"/>
+              <w:insideV w:val="single" w:sz="6" w:space="0" w:color="D9D9D9"/>
+            </w:tcBorders>
+          </w:tcPr>
+          <w:p>
+            <w:pPr>
+              <w:spacing w:after="0"/>
+            </w:pPr>
+            <w:r/>
+            <w:r>
+              <w:rPr>
+                <w:b w:val="0"/>
+                <w:sz w:val="18"/>
+              </w:rPr>
+              <w:t>EXPENSE.REPORT, category and monthly summaries</w:t>
+            </w:r>
+          </w:p>
+        </w:tc>
+      </w:tr>
+      <w:tr>
+        <w:tc>
+          <w:tcPr>
+            <w:tcW w:type="dxa" w:w="3312"/>
+            <w:vAlign w:val="center"/>
+            <w:tcBorders>
+              <w:top w:val="single" w:sz="6" w:space="0" w:color="D9D9D9"/>
+              <w:left w:val="single" w:sz="6" w:space="0" w:color="D9D9D9"/>
+              <w:bottom w:val="single" w:sz="6" w:space="0" w:color="D9D9D9"/>
+              <w:right w:val="single" w:sz="6" w:space="0" w:color="D9D9D9"/>
+              <w:insideH w:val="single" w:sz="6" w:space="0" w:color="D9D9D9"/>
+              <w:insideV w:val="single" w:sz="6" w:space="0" w:color="D9D9D9"/>
+            </w:tcBorders>
+            <w:shd w:fill="F3F5F7"/>
+          </w:tcPr>
+          <w:p>
+            <w:pPr>
+              <w:spacing w:after="0"/>
+            </w:pPr>
+            <w:r/>
+            <w:r>
+              <w:rPr>
+                <w:b w:val="0"/>
+                <w:sz w:val="18"/>
+              </w:rPr>
+              <w:t>Control</w:t>
+            </w:r>
+          </w:p>
+        </w:tc>
+        <w:tc>
+          <w:tcPr>
+            <w:tcW w:type="dxa" w:w="3312"/>
+            <w:vAlign w:val="center"/>
+            <w:tcBorders>
+              <w:top w:val="single" w:sz="6" w:space="0" w:color="D9D9D9"/>
+              <w:left w:val="single" w:sz="6" w:space="0" w:color="D9D9D9"/>
+              <w:bottom w:val="single" w:sz="6" w:space="0" w:color="D9D9D9"/>
+              <w:right w:val="single" w:sz="6" w:space="0" w:color="D9D9D9"/>
+              <w:insideH w:val="single" w:sz="6" w:space="0" w:color="D9D9D9"/>
+              <w:insideV w:val="single" w:sz="6" w:space="0" w:color="D9D9D9"/>
+            </w:tcBorders>
+            <w:shd w:fill="F3F5F7"/>
+          </w:tcPr>
+          <w:p>
+            <w:pPr>
+              <w:spacing w:after="0"/>
+            </w:pPr>
+            <w:r/>
+            <w:r>
+              <w:rPr>
+                <w:b w:val="0"/>
+                <w:sz w:val="18"/>
+              </w:rPr>
+              <w:t>Before/after record counts</w:t>
+            </w:r>
+          </w:p>
+        </w:tc>
+        <w:tc>
+          <w:tcPr>
+            <w:tcW w:type="dxa" w:w="3312"/>
+            <w:vAlign w:val="center"/>
+            <w:tcBorders>
+              <w:top w:val="single" w:sz="6" w:space="0" w:color="D9D9D9"/>
+              <w:left w:val="single" w:sz="6" w:space="0" w:color="D9D9D9"/>
+              <w:bottom w:val="single" w:sz="6" w:space="0" w:color="D9D9D9"/>
+              <w:right w:val="single" w:sz="6" w:space="0" w:color="D9D9D9"/>
+              <w:insideH w:val="single" w:sz="6" w:space="0" w:color="D9D9D9"/>
+              <w:insideV w:val="single" w:sz="6" w:space="0" w:color="D9D9D9"/>
+            </w:tcBorders>
+            <w:shd w:fill="F3F5F7"/>
+          </w:tcPr>
+          <w:p>
+            <w:pPr>
+              <w:spacing w:after="0"/>
+            </w:pPr>
+            <w:r/>
+            <w:r>
+              <w:rPr>
+                <w:b w:val="0"/>
+                <w:sz w:val="18"/>
+              </w:rPr>
+              <w:t>RC 0, RC 4, or RC 12</w:t>
+            </w:r>
+          </w:p>
+        </w:tc>
+      </w:tr>
+    </w:tbl>
+    <w:p>
+      <w:pPr>
+        <w:spacing w:after="20"/>
+      </w:pPr>
+    </w:p>
+    <w:p>
+      <w:pPr>
+        <w:pStyle w:val="Heading2"/>
+        <w:keepNext/>
+      </w:pPr>
+      <w:r>
+        <w:t>Module 5 Mainframe Data and VSAM</w:t>
+      </w:r>
+    </w:p>
+    <w:p>
+      <w:r>
+        <w:t>The mainframe storage layer uses project-owned VSAM KSDS resources. The employee KSDS provides keyed employee validation. The expense KSDS is the authoritative posted-expense store. Sequential datasets carry transaction input, result records, read requests, readback output, seed records, and generated reports. Dataset definitions and record layouts must remain aligned with COBOL copybooks and JCL DCB parameters.</w:t>
+      </w:r>
+    </w:p>
+    <w:p>
+      <w:pPr>
+        <w:pStyle w:val="Heading2"/>
+        <w:keepNext/>
+      </w:pPr>
+      <w:r>
+        <w:t>Module 6 COBOL Business Programs</w:t>
+      </w:r>
+    </w:p>
+    <w:p>
+      <w:r>
+        <w:t>EXPPOST owns mainframe posting rules: it validates the input, performs an employee keyed read, checks status and duplicates, writes accepted records to the expense KSDS, and writes an explicit result. EXPREAD performs a keyed read by the 12-byte expense ID. EXPRPT scans the expense master, writes detail lines and totals, and produces the report consumed by the integration layer. FILE STATUS and meaningful diagnostics distinguish an actual failure from a business rejection.</w:t>
+      </w:r>
+    </w:p>
+    <w:p>
+      <w:pPr>
+        <w:pStyle w:val="Heading2"/>
+        <w:keepNext/>
+      </w:pPr>
+      <w:r>
+        <w:t>Module 7 JCL and Zowe Execution</w:t>
+      </w:r>
+    </w:p>
+    <w:p>
+      <w:r>
+        <w:t>JCL connects programs to datasets through DD names and controls allocation, compilation, execution, and output. IGYWCL compiles the COBOL programs and writes load modules to the load library. Zowe CLI communicates with z/OSMF to upload members, submit jobs, poll status, retrieve JES spool, and read result datasets. The live adapter uses one batch-level transaction dataset and one EXPPOST job to reduce overhead while avoiding the shared-dataset contention path.</w:t>
+      </w:r>
+    </w:p>
+    <w:p>
+      <w:pPr>
+        <w:pStyle w:val="Heading2"/>
+        <w:keepNext/>
+      </w:pPr>
+      <w:r>
+        <w:t>Module 8 REXX Automation and Monitoring</w:t>
+      </w:r>
+    </w:p>
+    <w:p>
+      <w:r>
+        <w:t>EXPMON.rexx is a bounded TSO/E automation utility invoked by EXPMON.jcl after EXPPOST. It reads the result dataset read-only through ALLOC and EXECIO, counts POSTED, REJECTED, FAILED, and malformed records, frees the allocation, and returns a scheduler-friendly condition code. It does not submit arbitrary commands and has not been claimed as TSO/E-verified until an actual mainframe run produces JES evidence.</w:t>
+      </w:r>
+    </w:p>
+    <w:tbl>
+      <w:tblPr>
+        <w:tblStyle w:val="TableGrid"/>
+        <w:tblW w:type="auto" w:w="0"/>
+        <w:jc w:val="center"/>
+        <w:tblLook w:firstColumn="1" w:firstRow="1" w:lastColumn="0" w:lastRow="0" w:noHBand="0" w:noVBand="1" w:val="04A0"/>
+      </w:tblPr>
+      <w:tblGrid>
+        <w:gridCol w:w="3312"/>
+        <w:gridCol w:w="3312"/>
+        <w:gridCol w:w="3312"/>
+      </w:tblGrid>
+      <w:tr>
+        <w:tc>
+          <w:tcPr>
+            <w:tcW w:type="dxa" w:w="3312"/>
+            <w:vAlign w:val="center"/>
+            <w:tcBorders>
+              <w:top w:val="single" w:sz="6" w:space="0" w:color="D9D9D9"/>
+              <w:left w:val="single" w:sz="6" w:space="0" w:color="D9D9D9"/>
+              <w:bottom w:val="single" w:sz="6" w:space="0" w:color="D9D9D9"/>
+              <w:right w:val="single" w:sz="6" w:space="0" w:color="D9D9D9"/>
+              <w:insideH w:val="single" w:sz="6" w:space="0" w:color="D9D9D9"/>
+              <w:insideV w:val="single" w:sz="6" w:space="0" w:color="D9D9D9"/>
+            </w:tcBorders>
+            <w:shd w:fill="17365D"/>
+          </w:tcPr>
+          <w:p>
+            <w:pPr>
+              <w:spacing w:after="0"/>
+            </w:pPr>
+            <w:r/>
+            <w:r>
+              <w:rPr>
+                <w:b/>
+                <w:color w:val="FFFFFF"/>
+                <w:sz w:val="18"/>
+              </w:rPr>
+              <w:t>RC</w:t>
+            </w:r>
+          </w:p>
+        </w:tc>
+        <w:tc>
+          <w:tcPr>
+            <w:tcW w:type="dxa" w:w="3312"/>
+            <w:vAlign w:val="center"/>
+            <w:tcBorders>
+              <w:top w:val="single" w:sz="6" w:space="0" w:color="D9D9D9"/>
+              <w:left w:val="single" w:sz="6" w:space="0" w:color="D9D9D9"/>
+              <w:bottom w:val="single" w:sz="6" w:space="0" w:color="D9D9D9"/>
+              <w:right w:val="single" w:sz="6" w:space="0" w:color="D9D9D9"/>
+              <w:insideH w:val="single" w:sz="6" w:space="0" w:color="D9D9D9"/>
+              <w:insideV w:val="single" w:sz="6" w:space="0" w:color="D9D9D9"/>
+            </w:tcBorders>
+            <w:shd w:fill="17365D"/>
+          </w:tcPr>
+          <w:p>
+            <w:pPr>
+              <w:spacing w:after="0"/>
+            </w:pPr>
+            <w:r/>
+            <w:r>
+              <w:rPr>
+                <w:b/>
+                <w:color w:val="FFFFFF"/>
+                <w:sz w:val="18"/>
+              </w:rPr>
+              <w:t>Meaning</w:t>
+            </w:r>
+          </w:p>
+        </w:tc>
+        <w:tc>
+          <w:tcPr>
+            <w:tcW w:type="dxa" w:w="3312"/>
+            <w:vAlign w:val="center"/>
+            <w:tcBorders>
+              <w:top w:val="single" w:sz="6" w:space="0" w:color="D9D9D9"/>
+              <w:left w:val="single" w:sz="6" w:space="0" w:color="D9D9D9"/>
+              <w:bottom w:val="single" w:sz="6" w:space="0" w:color="D9D9D9"/>
+              <w:right w:val="single" w:sz="6" w:space="0" w:color="D9D9D9"/>
+              <w:insideH w:val="single" w:sz="6" w:space="0" w:color="D9D9D9"/>
+              <w:insideV w:val="single" w:sz="6" w:space="0" w:color="D9D9D9"/>
+            </w:tcBorders>
+            <w:shd w:fill="17365D"/>
+          </w:tcPr>
+          <w:p>
+            <w:pPr>
+              <w:spacing w:after="0"/>
+            </w:pPr>
+            <w:r/>
+            <w:r>
+              <w:rPr>
+                <w:b/>
+                <w:color w:val="FFFFFF"/>
+                <w:sz w:val="18"/>
+              </w:rPr>
+              <w:t>Next action</w:t>
+            </w:r>
+          </w:p>
+        </w:tc>
+      </w:tr>
+      <w:tr>
+        <w:tc>
+          <w:tcPr>
+            <w:tcW w:type="dxa" w:w="3312"/>
+            <w:vAlign w:val="center"/>
+            <w:tcBorders>
+              <w:top w:val="single" w:sz="6" w:space="0" w:color="D9D9D9"/>
+              <w:left w:val="single" w:sz="6" w:space="0" w:color="D9D9D9"/>
+              <w:bottom w:val="single" w:sz="6" w:space="0" w:color="D9D9D9"/>
+              <w:right w:val="single" w:sz="6" w:space="0" w:color="D9D9D9"/>
+              <w:insideH w:val="single" w:sz="6" w:space="0" w:color="D9D9D9"/>
+              <w:insideV w:val="single" w:sz="6" w:space="0" w:color="D9D9D9"/>
+            </w:tcBorders>
+          </w:tcPr>
+          <w:p>
+            <w:pPr>
+              <w:spacing w:after="0"/>
+            </w:pPr>
+            <w:r/>
+            <w:r>
+              <w:rPr>
+                <w:b w:val="0"/>
+                <w:sz w:val="18"/>
+              </w:rPr>
+              <w:t>0</w:t>
+            </w:r>
+          </w:p>
+        </w:tc>
+        <w:tc>
+          <w:tcPr>
+            <w:tcW w:type="dxa" w:w="3312"/>
+            <w:vAlign w:val="center"/>
+            <w:tcBorders>
+              <w:top w:val="single" w:sz="6" w:space="0" w:color="D9D9D9"/>
+              <w:left w:val="single" w:sz="6" w:space="0" w:color="D9D9D9"/>
+              <w:bottom w:val="single" w:sz="6" w:space="0" w:color="D9D9D9"/>
+              <w:right w:val="single" w:sz="6" w:space="0" w:color="D9D9D9"/>
+              <w:insideH w:val="single" w:sz="6" w:space="0" w:color="D9D9D9"/>
+              <w:insideV w:val="single" w:sz="6" w:space="0" w:color="D9D9D9"/>
+            </w:tcBorders>
+          </w:tcPr>
+          <w:p>
+            <w:pPr>
+              <w:spacing w:after="0"/>
+            </w:pPr>
+            <w:r/>
+            <w:r>
+              <w:rPr>
+                <w:b w:val="0"/>
+                <w:sz w:val="18"/>
+              </w:rPr>
+              <w:t>All result records are POSTED</w:t>
+            </w:r>
+          </w:p>
+        </w:tc>
+        <w:tc>
+          <w:tcPr>
+            <w:tcW w:type="dxa" w:w="3312"/>
+            <w:vAlign w:val="center"/>
+            <w:tcBorders>
+              <w:top w:val="single" w:sz="6" w:space="0" w:color="D9D9D9"/>
+              <w:left w:val="single" w:sz="6" w:space="0" w:color="D9D9D9"/>
+              <w:bottom w:val="single" w:sz="6" w:space="0" w:color="D9D9D9"/>
+              <w:right w:val="single" w:sz="6" w:space="0" w:color="D9D9D9"/>
+              <w:insideH w:val="single" w:sz="6" w:space="0" w:color="D9D9D9"/>
+              <w:insideV w:val="single" w:sz="6" w:space="0" w:color="D9D9D9"/>
+            </w:tcBorders>
+          </w:tcPr>
+          <w:p>
+            <w:pPr>
+              <w:spacing w:after="0"/>
+            </w:pPr>
+            <w:r/>
+            <w:r>
+              <w:rPr>
+                <w:b w:val="0"/>
+                <w:sz w:val="18"/>
+              </w:rPr>
+              <w:t>Continue to EXPREAD and EXPRPT verification</w:t>
+            </w:r>
+          </w:p>
+        </w:tc>
+      </w:tr>
+      <w:tr>
+        <w:tc>
+          <w:tcPr>
+            <w:tcW w:type="dxa" w:w="3312"/>
+            <w:vAlign w:val="center"/>
+            <w:tcBorders>
+              <w:top w:val="single" w:sz="6" w:space="0" w:color="D9D9D9"/>
+              <w:left w:val="single" w:sz="6" w:space="0" w:color="D9D9D9"/>
+              <w:bottom w:val="single" w:sz="6" w:space="0" w:color="D9D9D9"/>
+              <w:right w:val="single" w:sz="6" w:space="0" w:color="D9D9D9"/>
+              <w:insideH w:val="single" w:sz="6" w:space="0" w:color="D9D9D9"/>
+              <w:insideV w:val="single" w:sz="6" w:space="0" w:color="D9D9D9"/>
+            </w:tcBorders>
+            <w:shd w:fill="F3F5F7"/>
+          </w:tcPr>
+          <w:p>
+            <w:pPr>
+              <w:spacing w:after="0"/>
+            </w:pPr>
+            <w:r/>
+            <w:r>
+              <w:rPr>
+                <w:b w:val="0"/>
+                <w:sz w:val="18"/>
+              </w:rPr>
+              <w:t>4</w:t>
+            </w:r>
+          </w:p>
+        </w:tc>
+        <w:tc>
+          <w:tcPr>
+            <w:tcW w:type="dxa" w:w="3312"/>
+            <w:vAlign w:val="center"/>
+            <w:tcBorders>
+              <w:top w:val="single" w:sz="6" w:space="0" w:color="D9D9D9"/>
+              <w:left w:val="single" w:sz="6" w:space="0" w:color="D9D9D9"/>
+              <w:bottom w:val="single" w:sz="6" w:space="0" w:color="D9D9D9"/>
+              <w:right w:val="single" w:sz="6" w:space="0" w:color="D9D9D9"/>
+              <w:insideH w:val="single" w:sz="6" w:space="0" w:color="D9D9D9"/>
+              <w:insideV w:val="single" w:sz="6" w:space="0" w:color="D9D9D9"/>
+            </w:tcBorders>
+            <w:shd w:fill="F3F5F7"/>
+          </w:tcPr>
+          <w:p>
+            <w:pPr>
+              <w:spacing w:after="0"/>
+            </w:pPr>
+            <w:r/>
+            <w:r>
+              <w:rPr>
+                <w:b w:val="0"/>
+                <w:sz w:val="18"/>
+              </w:rPr>
+              <w:t>Processing valid but one or more records are REJECTED</w:t>
+            </w:r>
+          </w:p>
+        </w:tc>
+        <w:tc>
+          <w:tcPr>
+            <w:tcW w:type="dxa" w:w="3312"/>
+            <w:vAlign w:val="center"/>
+            <w:tcBorders>
+              <w:top w:val="single" w:sz="6" w:space="0" w:color="D9D9D9"/>
+              <w:left w:val="single" w:sz="6" w:space="0" w:color="D9D9D9"/>
+              <w:bottom w:val="single" w:sz="6" w:space="0" w:color="D9D9D9"/>
+              <w:right w:val="single" w:sz="6" w:space="0" w:color="D9D9D9"/>
+              <w:insideH w:val="single" w:sz="6" w:space="0" w:color="D9D9D9"/>
+              <w:insideV w:val="single" w:sz="6" w:space="0" w:color="D9D9D9"/>
+            </w:tcBorders>
+            <w:shd w:fill="F3F5F7"/>
+          </w:tcPr>
+          <w:p>
+            <w:pPr>
+              <w:spacing w:after="0"/>
+            </w:pPr>
+            <w:r/>
+            <w:r>
+              <w:rPr>
+                <w:b w:val="0"/>
+                <w:sz w:val="18"/>
+              </w:rPr>
+              <w:t>Review exception details; do not call the batch fully successful</w:t>
+            </w:r>
+          </w:p>
+        </w:tc>
+      </w:tr>
+      <w:tr>
+        <w:tc>
+          <w:tcPr>
+            <w:tcW w:type="dxa" w:w="3312"/>
+            <w:vAlign w:val="center"/>
+            <w:tcBorders>
+              <w:top w:val="single" w:sz="6" w:space="0" w:color="D9D9D9"/>
+              <w:left w:val="single" w:sz="6" w:space="0" w:color="D9D9D9"/>
+              <w:bottom w:val="single" w:sz="6" w:space="0" w:color="D9D9D9"/>
+              <w:right w:val="single" w:sz="6" w:space="0" w:color="D9D9D9"/>
+              <w:insideH w:val="single" w:sz="6" w:space="0" w:color="D9D9D9"/>
+              <w:insideV w:val="single" w:sz="6" w:space="0" w:color="D9D9D9"/>
+            </w:tcBorders>
+          </w:tcPr>
+          <w:p>
+            <w:pPr>
+              <w:spacing w:after="0"/>
+            </w:pPr>
+            <w:r/>
+            <w:r>
+              <w:rPr>
+                <w:b w:val="0"/>
+                <w:sz w:val="18"/>
+              </w:rPr>
+              <w:t>12</w:t>
+            </w:r>
+          </w:p>
+        </w:tc>
+        <w:tc>
+          <w:tcPr>
+            <w:tcW w:type="dxa" w:w="3312"/>
+            <w:vAlign w:val="center"/>
+            <w:tcBorders>
+              <w:top w:val="single" w:sz="6" w:space="0" w:color="D9D9D9"/>
+              <w:left w:val="single" w:sz="6" w:space="0" w:color="D9D9D9"/>
+              <w:bottom w:val="single" w:sz="6" w:space="0" w:color="D9D9D9"/>
+              <w:right w:val="single" w:sz="6" w:space="0" w:color="D9D9D9"/>
+              <w:insideH w:val="single" w:sz="6" w:space="0" w:color="D9D9D9"/>
+              <w:insideV w:val="single" w:sz="6" w:space="0" w:color="D9D9D9"/>
+            </w:tcBorders>
+          </w:tcPr>
+          <w:p>
+            <w:pPr>
+              <w:spacing w:after="0"/>
+            </w:pPr>
+            <w:r/>
+            <w:r>
+              <w:rPr>
+                <w:b w:val="0"/>
+                <w:sz w:val="18"/>
+              </w:rPr>
+              <w:t>Malformed, unknown-status, missing, or unreadable result</w:t>
+            </w:r>
+          </w:p>
+        </w:tc>
+        <w:tc>
+          <w:tcPr>
+            <w:tcW w:type="dxa" w:w="3312"/>
+            <w:vAlign w:val="center"/>
+            <w:tcBorders>
+              <w:top w:val="single" w:sz="6" w:space="0" w:color="D9D9D9"/>
+              <w:left w:val="single" w:sz="6" w:space="0" w:color="D9D9D9"/>
+              <w:bottom w:val="single" w:sz="6" w:space="0" w:color="D9D9D9"/>
+              <w:right w:val="single" w:sz="6" w:space="0" w:color="D9D9D9"/>
+              <w:insideH w:val="single" w:sz="6" w:space="0" w:color="D9D9D9"/>
+              <w:insideV w:val="single" w:sz="6" w:space="0" w:color="D9D9D9"/>
+            </w:tcBorders>
+          </w:tcPr>
+          <w:p>
+            <w:pPr>
+              <w:spacing w:after="0"/>
+            </w:pPr>
+            <w:r/>
+            <w:r>
+              <w:rPr>
+                <w:b w:val="0"/>
+                <w:sz w:val="18"/>
+              </w:rPr>
+              <w:t>Stop and investigate job output, DD names, permissions, or dataset content</w:t>
+            </w:r>
+          </w:p>
+        </w:tc>
+      </w:tr>
+    </w:tbl>
+    <w:p>
+      <w:pPr>
+        <w:spacing w:after="20"/>
+      </w:pPr>
+    </w:p>
+    <w:p>
+      <w:pPr>
+        <w:pStyle w:val="Heading2"/>
+        <w:keepNext/>
+      </w:pPr>
+      <w:r>
+        <w:t>Module 9 Testing and Evidence</w:t>
+      </w:r>
+    </w:p>
+    <w:p>
+      <w:r>
+        <w:t>Testing is performed at several boundaries. Node tests cover fixed-width serialization, dedupe, validation, count mismatch, authorization, object scope, approval, rejection, posting, idempotency, batch controls, audit, and logout. FastAPI tests mock Zowe and verify unavailable, timeout, authorization, result parsing, and state transitions. Mainframe evidence requires actual job IDs, return codes, JES output, result records, VSAM readback, and report output. A CC 0000 job alone is not sufficient proof of a successful expense post.</w:t>
+      </w:r>
+    </w:p>
+    <w:p>
+      <w:pPr>
+        <w:pStyle w:val="Heading1"/>
+        <w:keepNext/>
+      </w:pPr>
+      <w:r>
         <w:t>Five Member Module Division</w:t>
       </w:r>
     </w:p>
     <w:p>
       <w:r>
-        <w:t>Each member should explain the purpose, important files or datasets, input and output, and one demonstration step.</w:t>
+        <w:t>Each member should explain the purpose, important files or datasets, input and output, dependencies, failure cases, and one demonstration step.</w:t>
       </w:r>
     </w:p>
     <w:tbl>
@@ -5849,7 +8101,7 @@
                 <w:color w:val="FFFFFF"/>
                 <w:sz w:val="18"/>
               </w:rPr>
-              <w:t>Topics to explain</w:t>
+              <w:t>Working responsibility</w:t>
             </w:r>
           </w:p>
         </w:tc>
@@ -5934,7 +8186,7 @@
                 <w:b w:val="0"/>
                 <w:sz w:val="18"/>
               </w:rPr>
-              <w:t>Frontend and user roles</w:t>
+              <w:t>Frontend and roles</w:t>
             </w:r>
           </w:p>
         </w:tc>
@@ -5961,7 +8213,7 @@
                 <w:b w:val="0"/>
                 <w:sz w:val="18"/>
               </w:rPr>
-              <w:t>Login, employee submission, manager approval, finance batch screens, statuses, live versus demo.</w:t>
+              <w:t>Explain pages, role navigation, claim form, approval screens, batch status, and live/demo separation.</w:t>
             </w:r>
           </w:p>
         </w:tc>
@@ -5988,7 +8240,7 @@
                 <w:b w:val="0"/>
                 <w:sz w:val="18"/>
               </w:rPr>
-              <w:t>Submit an expense and show Pending approval.</w:t>
+              <w:t>Submit a claim and show Pending approval.</w:t>
             </w:r>
           </w:p>
         </w:tc>
@@ -6046,7 +8298,7 @@
                 <w:b w:val="0"/>
                 <w:sz w:val="18"/>
               </w:rPr>
-              <w:t>FastAPI backend and security</w:t>
+              <w:t>Node workflow and security</w:t>
             </w:r>
           </w:p>
         </w:tc>
@@ -6074,7 +8326,7 @@
                 <w:b w:val="0"/>
                 <w:sz w:val="18"/>
               </w:rPr>
-              <w:t>Endpoints, validation, permissions, asynchronous states, duplicate protection, sanitized errors, server-side credentials.</w:t>
+              <w:t>Explain sessions, permissions, workflow states, audit, rejection reasons, and idempotent posting.</w:t>
             </w:r>
           </w:p>
         </w:tc>
@@ -6102,7 +8354,7 @@
                 <w:b w:val="0"/>
                 <w:sz w:val="18"/>
               </w:rPr>
-              <w:t>Show API health, request ID, and permission behavior.</w:t>
+              <w:t>Approve, reject with reason, and show authorization denial.</w:t>
             </w:r>
           </w:p>
         </w:tc>
@@ -6158,7 +8410,7 @@
                 <w:b w:val="0"/>
                 <w:sz w:val="18"/>
               </w:rPr>
-              <w:t>Mainframe data and VSAM</w:t>
+              <w:t>FastAPI and simulator</w:t>
             </w:r>
           </w:p>
         </w:tc>
@@ -6185,7 +8437,7 @@
                 <w:b w:val="0"/>
                 <w:sz w:val="18"/>
               </w:rPr>
-              <w:t>Employee KSDS, expense KSDS, record layouts, keys, supporting datasets, authoritative storage.</w:t>
+              <w:t>Explain API contracts, Zowe adapter boundary, fixed-width serialization, dedupe, validation, exceptions, and count control.</w:t>
             </w:r>
           </w:p>
         </w:tc>
@@ -6212,7 +8464,7 @@
                 <w:b w:val="0"/>
                 <w:sz w:val="18"/>
               </w:rPr>
-              <w:t>Show dataset names and explain one 80-byte record.</w:t>
+              <w:t>Show API state and run a simulator batch with exceptions.</w:t>
             </w:r>
           </w:p>
         </w:tc>
@@ -6270,7 +8522,7 @@
                 <w:b w:val="0"/>
                 <w:sz w:val="18"/>
               </w:rPr>
-              <w:t>COBOL, JCL, and Zowe</w:t>
+              <w:t>COBOL, VSAM, JCL, and Zowe</w:t>
             </w:r>
           </w:p>
         </w:tc>
@@ -6298,7 +8550,7 @@
                 <w:b w:val="0"/>
                 <w:sz w:val="18"/>
               </w:rPr>
-              <w:t>EXPPOST, EXPREAD, EXPRPT, DD names, IGYWCL, JES jobs, result records.</w:t>
+              <w:t>Explain record layouts, keys, DD names, EXPPOST/EXPREAD/EXPRPT, IGYWCL, JES, and dataset flow.</w:t>
             </w:r>
           </w:p>
         </w:tc>
@@ -6326,7 +8578,7 @@
                 <w:b w:val="0"/>
                 <w:sz w:val="18"/>
               </w:rPr>
-              <w:t>Show job ID, return code, result, and readback.</w:t>
+              <w:t>Show a job ID, return code, result record, readback, and report.</w:t>
             </w:r>
           </w:p>
         </w:tc>
@@ -6382,7 +8634,7 @@
                 <w:b w:val="0"/>
                 <w:sz w:val="18"/>
               </w:rPr>
-              <w:t>Testing and operations</w:t>
+              <w:t>REXX, testing, and operations</w:t>
             </w:r>
           </w:p>
         </w:tc>
@@ -6409,7 +8661,7 @@
                 <w:b w:val="0"/>
                 <w:sz w:val="18"/>
               </w:rPr>
-              <w:t>EXPMON, batch control, evidence, failure handling, dataset safety, future work.</w:t>
+              <w:t>Explain EXPMON automation, RC handling, monitoring, test evidence, safe reruns, and limitations.</w:t>
             </w:r>
           </w:p>
         </w:tc>
@@ -6436,7 +8688,7 @@
                 <w:b w:val="0"/>
                 <w:sz w:val="18"/>
               </w:rPr>
-              <w:t>Run manager approval, finance batch, and confirm report.</w:t>
+              <w:t>Run or walk through EXPMON.jcl and interpret RC 0, 4, and 12.</w:t>
             </w:r>
           </w:p>
         </w:tc>

</xml_diff>